<commit_message>
feat(phase1): PITR dry-run verified — pg-restore-test recovers dmz DB from SeaweedFS backup
- infra/manifests/postgres/restore-test.yaml: 임시 복구 Cluster CR (apply-on-demand, not kept running)
  - serverName: "pg-main" 명시 필수 (미지정 시 "no target backup found" 에러)
  - backup 비활성화로 소스 백업 보호
- tests/smoke/pitr_dry_run.md: dry-run 전체 결과 기록 (백업 ID, 소요 시간, 테이블/레코드 검증)
- docs/ops/cnpg-backup.md: §5 PITR Dry-Run 검증 결과 섹션 추가 (2026-04-23, PASS)
- Documents/cnpg-backup.docx: docs-sync 갱신

검증 결과:
  - 백업 ID: 20260423T050431 (최신)
  - 복구 소요: 약 3분 20초
  - dmz DB: document(45행), ocr_result(40행) 확인
  - 클린업: pg-restore-test cluster+pods 삭제 완료

Co-Authored-By: Claude Sonnet 4.6 <noreply@anthropic.com>
</commit_message>
<xml_diff>
--- a/Documents/cnpg-backup.docx
+++ b/Documents/cnpg-backup.docx
@@ -28,7 +28,7 @@
         </w:p>
       </w:sdtContent>
     </w:sdt>
-    <w:bookmarkStart w:id="30" w:name="cnpg-barmanobjectstore-백업--복구-런북"/>
+    <w:bookmarkStart w:id="33" w:name="cnpg-barmanobjectstore-백업--복구-런북"/>
     <w:p>
       <w:pPr>
         <w:pStyle w:val="Heading1"/>
@@ -1923,2212 +1923,13 @@
       </w:r>
     </w:p>
     <w:bookmarkEnd w:id="16"/>
-    <w:bookmarkStart w:id="21" w:name="Xb4f852e146bdcc36c9ba3cfc40af2e1fe7fc00b"/>
+    <w:bookmarkStart w:id="19" w:name="Xd1536d37d6d28055b48ef5a3d98599efcb3a425"/>
     <w:p>
       <w:pPr>
         <w:pStyle w:val="Heading2"/>
       </w:pPr>
       <w:r>
-        <w:t xml:space="preserve">5. 복구 절차 (Point-in-Time Recovery)</w:t>
-      </w:r>
-    </w:p>
-    <w:bookmarkStart w:id="17" w:name="Xf5e586c5bbb78a99fac699224799a62744dd827"/>
-    <w:p>
-      <w:pPr>
-        <w:pStyle w:val="Heading3"/>
-      </w:pPr>
-      <w:r>
-        <w:t xml:space="preserve">5.1 사전 준비</w:t>
-      </w:r>
-    </w:p>
-    <w:p>
-      <w:pPr>
-        <w:pStyle w:val="Compact"/>
-        <w:numPr>
-          <w:ilvl w:val="0"/>
-          <w:numId w:val="1002"/>
-        </w:numPr>
-      </w:pPr>
-      <w:r>
-        <w:t xml:space="preserve">복구할 시점(target time) 결정 — RFC3339 형식:</w:t>
-      </w:r>
-      <w:r>
-        <w:t xml:space="preserve"> </w:t>
-      </w:r>
-      <w:r>
-        <w:rPr>
-          <w:rStyle w:val="VerbatimChar"/>
-        </w:rPr>
-        <w:t xml:space="preserve">2026-04-22T03:00:00+09:00</w:t>
-      </w:r>
-    </w:p>
-    <w:p>
-      <w:pPr>
-        <w:pStyle w:val="Compact"/>
-        <w:numPr>
-          <w:ilvl w:val="0"/>
-          <w:numId w:val="1002"/>
-        </w:numPr>
-      </w:pPr>
-      <w:r>
-        <w:t xml:space="preserve">복구 대상 네임스페이스 및 Cluster 이름 결정 (기존과 다른 이름 권장)</w:t>
-      </w:r>
-    </w:p>
-    <w:p>
-      <w:pPr>
-        <w:pStyle w:val="Compact"/>
-        <w:numPr>
-          <w:ilvl w:val="0"/>
-          <w:numId w:val="1002"/>
-        </w:numPr>
-      </w:pPr>
-      <w:r>
-        <w:t xml:space="preserve">S3에서 해당 시점 이전의 백업 ID 확인:</w:t>
-      </w:r>
-    </w:p>
-    <w:p>
-      <w:pPr>
-        <w:pStyle w:val="SourceCode"/>
-      </w:pPr>
-      <w:r>
-        <w:rPr>
-          <w:rStyle w:val="ExtensionTok"/>
-        </w:rPr>
-        <w:t xml:space="preserve">kubectl</w:t>
-      </w:r>
-      <w:r>
-        <w:rPr>
-          <w:rStyle w:val="NormalTok"/>
-        </w:rPr>
-        <w:t xml:space="preserve"> </w:t>
-      </w:r>
-      <w:r>
-        <w:rPr>
-          <w:rStyle w:val="AttributeTok"/>
-        </w:rPr>
-        <w:t xml:space="preserve">-n</w:t>
-      </w:r>
-      <w:r>
-        <w:rPr>
-          <w:rStyle w:val="NormalTok"/>
-        </w:rPr>
-        <w:t xml:space="preserve"> processing run s3ls </w:t>
-      </w:r>
-      <w:r>
-        <w:rPr>
-          <w:rStyle w:val="AttributeTok"/>
-        </w:rPr>
-        <w:t xml:space="preserve">--rm</w:t>
-      </w:r>
-      <w:r>
-        <w:rPr>
-          <w:rStyle w:val="NormalTok"/>
-        </w:rPr>
-        <w:t xml:space="preserve"> </w:t>
-      </w:r>
-      <w:r>
-        <w:rPr>
-          <w:rStyle w:val="AttributeTok"/>
-        </w:rPr>
-        <w:t xml:space="preserve">-i</w:t>
-      </w:r>
-      <w:r>
-        <w:rPr>
-          <w:rStyle w:val="NormalTok"/>
-        </w:rPr>
-        <w:t xml:space="preserve"> </w:t>
-      </w:r>
-      <w:r>
-        <w:rPr>
-          <w:rStyle w:val="AttributeTok"/>
-        </w:rPr>
-        <w:t xml:space="preserve">--restart</w:t>
-      </w:r>
-      <w:r>
-        <w:rPr>
-          <w:rStyle w:val="OperatorTok"/>
-        </w:rPr>
-        <w:t xml:space="preserve">=</w:t>
-      </w:r>
-      <w:r>
-        <w:rPr>
-          <w:rStyle w:val="NormalTok"/>
-        </w:rPr>
-        <w:t xml:space="preserve">Never </w:t>
-      </w:r>
-      <w:r>
-        <w:rPr>
-          <w:rStyle w:val="AttributeTok"/>
-        </w:rPr>
-        <w:t xml:space="preserve">--image</w:t>
-      </w:r>
-      <w:r>
-        <w:rPr>
-          <w:rStyle w:val="OperatorTok"/>
-        </w:rPr>
-        <w:t xml:space="preserve">=</w:t>
-      </w:r>
-      <w:r>
-        <w:rPr>
-          <w:rStyle w:val="NormalTok"/>
-        </w:rPr>
-        <w:t xml:space="preserve">amazon/aws-cli:2.15.30 </w:t>
-      </w:r>
-      <w:r>
-        <w:rPr>
-          <w:rStyle w:val="DataTypeTok"/>
-        </w:rPr>
-        <w:t xml:space="preserve">\</w:t>
-      </w:r>
-      <w:r>
-        <w:br/>
-      </w:r>
-      <w:r>
-        <w:rPr>
-          <w:rStyle w:val="NormalTok"/>
-        </w:rPr>
-        <w:t xml:space="preserve">  </w:t>
-      </w:r>
-      <w:r>
-        <w:rPr>
-          <w:rStyle w:val="AttributeTok"/>
-        </w:rPr>
-        <w:t xml:space="preserve">--env</w:t>
-      </w:r>
-      <w:r>
-        <w:rPr>
-          <w:rStyle w:val="OperatorTok"/>
-        </w:rPr>
-        <w:t xml:space="preserve">=</w:t>
-      </w:r>
-      <w:r>
-        <w:rPr>
-          <w:rStyle w:val="StringTok"/>
-        </w:rPr>
-        <w:t xml:space="preserve">"AWS_ACCESS_KEY_ID=dev-backup-access-key"</w:t>
-      </w:r>
-      <w:r>
-        <w:rPr>
-          <w:rStyle w:val="NormalTok"/>
-        </w:rPr>
-        <w:t xml:space="preserve"> </w:t>
-      </w:r>
-      <w:r>
-        <w:rPr>
-          <w:rStyle w:val="DataTypeTok"/>
-        </w:rPr>
-        <w:t xml:space="preserve">\</w:t>
-      </w:r>
-      <w:r>
-        <w:br/>
-      </w:r>
-      <w:r>
-        <w:rPr>
-          <w:rStyle w:val="NormalTok"/>
-        </w:rPr>
-        <w:t xml:space="preserve">  </w:t>
-      </w:r>
-      <w:r>
-        <w:rPr>
-          <w:rStyle w:val="AttributeTok"/>
-        </w:rPr>
-        <w:t xml:space="preserve">--env</w:t>
-      </w:r>
-      <w:r>
-        <w:rPr>
-          <w:rStyle w:val="OperatorTok"/>
-        </w:rPr>
-        <w:t xml:space="preserve">=</w:t>
-      </w:r>
-      <w:r>
-        <w:rPr>
-          <w:rStyle w:val="StringTok"/>
-        </w:rPr>
-        <w:t xml:space="preserve">"AWS_SECRET_ACCESS_KEY=dev-backup-secret-key"</w:t>
-      </w:r>
-      <w:r>
-        <w:rPr>
-          <w:rStyle w:val="NormalTok"/>
-        </w:rPr>
-        <w:t xml:space="preserve"> </w:t>
-      </w:r>
-      <w:r>
-        <w:rPr>
-          <w:rStyle w:val="DataTypeTok"/>
-        </w:rPr>
-        <w:t xml:space="preserve">\</w:t>
-      </w:r>
-      <w:r>
-        <w:br/>
-      </w:r>
-      <w:r>
-        <w:rPr>
-          <w:rStyle w:val="NormalTok"/>
-        </w:rPr>
-        <w:t xml:space="preserve">  </w:t>
-      </w:r>
-      <w:r>
-        <w:rPr>
-          <w:rStyle w:val="AttributeTok"/>
-        </w:rPr>
-        <w:t xml:space="preserve">--env</w:t>
-      </w:r>
-      <w:r>
-        <w:rPr>
-          <w:rStyle w:val="OperatorTok"/>
-        </w:rPr>
-        <w:t xml:space="preserve">=</w:t>
-      </w:r>
-      <w:r>
-        <w:rPr>
-          <w:rStyle w:val="StringTok"/>
-        </w:rPr>
-        <w:t xml:space="preserve">"AWS_DEFAULT_REGION=us-east-1"</w:t>
-      </w:r>
-      <w:r>
-        <w:rPr>
-          <w:rStyle w:val="NormalTok"/>
-        </w:rPr>
-        <w:t xml:space="preserve"> </w:t>
-      </w:r>
-      <w:r>
-        <w:rPr>
-          <w:rStyle w:val="DataTypeTok"/>
-        </w:rPr>
-        <w:t xml:space="preserve">\</w:t>
-      </w:r>
-      <w:r>
-        <w:br/>
-      </w:r>
-      <w:r>
-        <w:rPr>
-          <w:rStyle w:val="NormalTok"/>
-        </w:rPr>
-        <w:t xml:space="preserve">  </w:t>
-      </w:r>
-      <w:r>
-        <w:rPr>
-          <w:rStyle w:val="AttributeTok"/>
-        </w:rPr>
-        <w:t xml:space="preserve">--command</w:t>
-      </w:r>
-      <w:r>
-        <w:rPr>
-          <w:rStyle w:val="NormalTok"/>
-        </w:rPr>
-        <w:t xml:space="preserve"> </w:t>
-      </w:r>
-      <w:r>
-        <w:rPr>
-          <w:rStyle w:val="AttributeTok"/>
-        </w:rPr>
-        <w:t xml:space="preserve">--</w:t>
-      </w:r>
-      <w:r>
-        <w:rPr>
-          <w:rStyle w:val="NormalTok"/>
-        </w:rPr>
-        <w:t xml:space="preserve"> aws </w:t>
-      </w:r>
-      <w:r>
-        <w:rPr>
-          <w:rStyle w:val="DataTypeTok"/>
-        </w:rPr>
-        <w:t xml:space="preserve">\</w:t>
-      </w:r>
-      <w:r>
-        <w:br/>
-      </w:r>
-      <w:r>
-        <w:rPr>
-          <w:rStyle w:val="NormalTok"/>
-        </w:rPr>
-        <w:t xml:space="preserve">  </w:t>
-      </w:r>
-      <w:r>
-        <w:rPr>
-          <w:rStyle w:val="AttributeTok"/>
-        </w:rPr>
-        <w:t xml:space="preserve">--endpoint-url</w:t>
-      </w:r>
-      <w:r>
-        <w:rPr>
-          <w:rStyle w:val="NormalTok"/>
-        </w:rPr>
-        <w:t xml:space="preserve"> </w:t>
-      </w:r>
-      <w:r>
-        <w:rPr>
-          <w:rStyle w:val="StringTok"/>
-        </w:rPr>
-        <w:t xml:space="preserve">"http://seaweedfs-s3.processing.svc.cluster.local:8333"</w:t>
-      </w:r>
-      <w:r>
-        <w:rPr>
-          <w:rStyle w:val="NormalTok"/>
-        </w:rPr>
-        <w:t xml:space="preserve"> </w:t>
-      </w:r>
-      <w:r>
-        <w:rPr>
-          <w:rStyle w:val="DataTypeTok"/>
-        </w:rPr>
-        <w:t xml:space="preserve">\</w:t>
-      </w:r>
-      <w:r>
-        <w:br/>
-      </w:r>
-      <w:r>
-        <w:rPr>
-          <w:rStyle w:val="NormalTok"/>
-        </w:rPr>
-        <w:t xml:space="preserve">  s3 ls s3://pg-backups/pg-main/pg-main/base/</w:t>
-      </w:r>
-    </w:p>
-    <w:bookmarkEnd w:id="17"/>
-    <w:bookmarkStart w:id="18" w:name="X6f644232a2675851c21917be0318db93dfa4771"/>
-    <w:p>
-      <w:pPr>
-        <w:pStyle w:val="Heading3"/>
-      </w:pPr>
-      <w:r>
-        <w:t xml:space="preserve">5.2 PITR Cluster 매니페스트</w:t>
-      </w:r>
-    </w:p>
-    <w:p>
-      <w:pPr>
-        <w:pStyle w:val="SourceCode"/>
-      </w:pPr>
-      <w:r>
-        <w:rPr>
-          <w:rStyle w:val="FunctionTok"/>
-        </w:rPr>
-        <w:t xml:space="preserve">apiVersion</w:t>
-      </w:r>
-      <w:r>
-        <w:rPr>
-          <w:rStyle w:val="KeywordTok"/>
-        </w:rPr>
-        <w:t xml:space="preserve">:</w:t>
-      </w:r>
-      <w:r>
-        <w:rPr>
-          <w:rStyle w:val="AttributeTok"/>
-        </w:rPr>
-        <w:t xml:space="preserve"> postgresql.cnpg.io/v1</w:t>
-      </w:r>
-      <w:r>
-        <w:br/>
-      </w:r>
-      <w:r>
-        <w:rPr>
-          <w:rStyle w:val="FunctionTok"/>
-        </w:rPr>
-        <w:t xml:space="preserve">kind</w:t>
-      </w:r>
-      <w:r>
-        <w:rPr>
-          <w:rStyle w:val="KeywordTok"/>
-        </w:rPr>
-        <w:t xml:space="preserve">:</w:t>
-      </w:r>
-      <w:r>
-        <w:rPr>
-          <w:rStyle w:val="AttributeTok"/>
-        </w:rPr>
-        <w:t xml:space="preserve"> Cluster</w:t>
-      </w:r>
-      <w:r>
-        <w:br/>
-      </w:r>
-      <w:r>
-        <w:rPr>
-          <w:rStyle w:val="FunctionTok"/>
-        </w:rPr>
-        <w:t xml:space="preserve">metadata</w:t>
-      </w:r>
-      <w:r>
-        <w:rPr>
-          <w:rStyle w:val="KeywordTok"/>
-        </w:rPr>
-        <w:t xml:space="preserve">:</w:t>
-      </w:r>
-      <w:r>
-        <w:br/>
-      </w:r>
-      <w:r>
-        <w:rPr>
-          <w:rStyle w:val="AttributeTok"/>
-        </w:rPr>
-        <w:t xml:space="preserve">  </w:t>
-      </w:r>
-      <w:r>
-        <w:rPr>
-          <w:rStyle w:val="FunctionTok"/>
-        </w:rPr>
-        <w:t xml:space="preserve">name</w:t>
-      </w:r>
-      <w:r>
-        <w:rPr>
-          <w:rStyle w:val="KeywordTok"/>
-        </w:rPr>
-        <w:t xml:space="preserve">:</w:t>
-      </w:r>
-      <w:r>
-        <w:rPr>
-          <w:rStyle w:val="AttributeTok"/>
-        </w:rPr>
-        <w:t xml:space="preserve"> pg-main-restore</w:t>
-      </w:r>
-      <w:r>
-        <w:br/>
-      </w:r>
-      <w:r>
-        <w:rPr>
-          <w:rStyle w:val="AttributeTok"/>
-        </w:rPr>
-        <w:t xml:space="preserve">  </w:t>
-      </w:r>
-      <w:r>
-        <w:rPr>
-          <w:rStyle w:val="FunctionTok"/>
-        </w:rPr>
-        <w:t xml:space="preserve">namespace</w:t>
-      </w:r>
-      <w:r>
-        <w:rPr>
-          <w:rStyle w:val="KeywordTok"/>
-        </w:rPr>
-        <w:t xml:space="preserve">:</w:t>
-      </w:r>
-      <w:r>
-        <w:rPr>
-          <w:rStyle w:val="AttributeTok"/>
-        </w:rPr>
-        <w:t xml:space="preserve"> processing</w:t>
-      </w:r>
-      <w:r>
-        <w:br/>
-      </w:r>
-      <w:r>
-        <w:rPr>
-          <w:rStyle w:val="FunctionTok"/>
-        </w:rPr>
-        <w:t xml:space="preserve">spec</w:t>
-      </w:r>
-      <w:r>
-        <w:rPr>
-          <w:rStyle w:val="KeywordTok"/>
-        </w:rPr>
-        <w:t xml:space="preserve">:</w:t>
-      </w:r>
-      <w:r>
-        <w:br/>
-      </w:r>
-      <w:r>
-        <w:rPr>
-          <w:rStyle w:val="AttributeTok"/>
-        </w:rPr>
-        <w:t xml:space="preserve">  </w:t>
-      </w:r>
-      <w:r>
-        <w:rPr>
-          <w:rStyle w:val="FunctionTok"/>
-        </w:rPr>
-        <w:t xml:space="preserve">instances</w:t>
-      </w:r>
-      <w:r>
-        <w:rPr>
-          <w:rStyle w:val="KeywordTok"/>
-        </w:rPr>
-        <w:t xml:space="preserve">:</w:t>
-      </w:r>
-      <w:r>
-        <w:rPr>
-          <w:rStyle w:val="AttributeTok"/>
-        </w:rPr>
-        <w:t xml:space="preserve"> </w:t>
-      </w:r>
-      <w:r>
-        <w:rPr>
-          <w:rStyle w:val="DecValTok"/>
-        </w:rPr>
-        <w:t xml:space="preserve">1</w:t>
-      </w:r>
-      <w:r>
-        <w:br/>
-      </w:r>
-      <w:r>
-        <w:rPr>
-          <w:rStyle w:val="AttributeTok"/>
-        </w:rPr>
-        <w:t xml:space="preserve">  </w:t>
-      </w:r>
-      <w:r>
-        <w:rPr>
-          <w:rStyle w:val="FunctionTok"/>
-        </w:rPr>
-        <w:t xml:space="preserve">imageName</w:t>
-      </w:r>
-      <w:r>
-        <w:rPr>
-          <w:rStyle w:val="KeywordTok"/>
-        </w:rPr>
-        <w:t xml:space="preserve">:</w:t>
-      </w:r>
-      <w:r>
-        <w:rPr>
-          <w:rStyle w:val="AttributeTok"/>
-        </w:rPr>
-        <w:t xml:space="preserve"> ghcr.io/cloudnative-pg/postgresql:16.2</w:t>
-      </w:r>
-      <w:r>
-        <w:br/>
-      </w:r>
-      <w:r>
-        <w:rPr>
-          <w:rStyle w:val="AttributeTok"/>
-        </w:rPr>
-        <w:t xml:space="preserve">  </w:t>
-      </w:r>
-      <w:r>
-        <w:rPr>
-          <w:rStyle w:val="FunctionTok"/>
-        </w:rPr>
-        <w:t xml:space="preserve">storage</w:t>
-      </w:r>
-      <w:r>
-        <w:rPr>
-          <w:rStyle w:val="KeywordTok"/>
-        </w:rPr>
-        <w:t xml:space="preserve">:</w:t>
-      </w:r>
-      <w:r>
-        <w:br/>
-      </w:r>
-      <w:r>
-        <w:rPr>
-          <w:rStyle w:val="AttributeTok"/>
-        </w:rPr>
-        <w:t xml:space="preserve">    </w:t>
-      </w:r>
-      <w:r>
-        <w:rPr>
-          <w:rStyle w:val="FunctionTok"/>
-        </w:rPr>
-        <w:t xml:space="preserve">size</w:t>
-      </w:r>
-      <w:r>
-        <w:rPr>
-          <w:rStyle w:val="KeywordTok"/>
-        </w:rPr>
-        <w:t xml:space="preserve">:</w:t>
-      </w:r>
-      <w:r>
-        <w:rPr>
-          <w:rStyle w:val="AttributeTok"/>
-        </w:rPr>
-        <w:t xml:space="preserve"> 10Gi</w:t>
-      </w:r>
-      <w:r>
-        <w:br/>
-      </w:r>
-      <w:r>
-        <w:rPr>
-          <w:rStyle w:val="AttributeTok"/>
-        </w:rPr>
-        <w:t xml:space="preserve">    </w:t>
-      </w:r>
-      <w:r>
-        <w:rPr>
-          <w:rStyle w:val="FunctionTok"/>
-        </w:rPr>
-        <w:t xml:space="preserve">storageClass</w:t>
-      </w:r>
-      <w:r>
-        <w:rPr>
-          <w:rStyle w:val="KeywordTok"/>
-        </w:rPr>
-        <w:t xml:space="preserve">:</w:t>
-      </w:r>
-      <w:r>
-        <w:rPr>
-          <w:rStyle w:val="AttributeTok"/>
-        </w:rPr>
-        <w:t xml:space="preserve"> standard</w:t>
-      </w:r>
-      <w:r>
-        <w:br/>
-      </w:r>
-      <w:r>
-        <w:rPr>
-          <w:rStyle w:val="AttributeTok"/>
-        </w:rPr>
-        <w:t xml:space="preserve">  </w:t>
-      </w:r>
-      <w:r>
-        <w:rPr>
-          <w:rStyle w:val="FunctionTok"/>
-        </w:rPr>
-        <w:t xml:space="preserve">bootstrap</w:t>
-      </w:r>
-      <w:r>
-        <w:rPr>
-          <w:rStyle w:val="KeywordTok"/>
-        </w:rPr>
-        <w:t xml:space="preserve">:</w:t>
-      </w:r>
-      <w:r>
-        <w:br/>
-      </w:r>
-      <w:r>
-        <w:rPr>
-          <w:rStyle w:val="AttributeTok"/>
-        </w:rPr>
-        <w:t xml:space="preserve">    </w:t>
-      </w:r>
-      <w:r>
-        <w:rPr>
-          <w:rStyle w:val="FunctionTok"/>
-        </w:rPr>
-        <w:t xml:space="preserve">recovery</w:t>
-      </w:r>
-      <w:r>
-        <w:rPr>
-          <w:rStyle w:val="KeywordTok"/>
-        </w:rPr>
-        <w:t xml:space="preserve">:</w:t>
-      </w:r>
-      <w:r>
-        <w:br/>
-      </w:r>
-      <w:r>
-        <w:rPr>
-          <w:rStyle w:val="AttributeTok"/>
-        </w:rPr>
-        <w:t xml:space="preserve">      </w:t>
-      </w:r>
-      <w:r>
-        <w:rPr>
-          <w:rStyle w:val="FunctionTok"/>
-        </w:rPr>
-        <w:t xml:space="preserve">source</w:t>
-      </w:r>
-      <w:r>
-        <w:rPr>
-          <w:rStyle w:val="KeywordTok"/>
-        </w:rPr>
-        <w:t xml:space="preserve">:</w:t>
-      </w:r>
-      <w:r>
-        <w:rPr>
-          <w:rStyle w:val="AttributeTok"/>
-        </w:rPr>
-        <w:t xml:space="preserve"> pg-main-backup</w:t>
-      </w:r>
-      <w:r>
-        <w:br/>
-      </w:r>
-      <w:r>
-        <w:rPr>
-          <w:rStyle w:val="AttributeTok"/>
-        </w:rPr>
-        <w:t xml:space="preserve">      </w:t>
-      </w:r>
-      <w:r>
-        <w:rPr>
-          <w:rStyle w:val="FunctionTok"/>
-        </w:rPr>
-        <w:t xml:space="preserve">recoveryTarget</w:t>
-      </w:r>
-      <w:r>
-        <w:rPr>
-          <w:rStyle w:val="KeywordTok"/>
-        </w:rPr>
-        <w:t xml:space="preserve">:</w:t>
-      </w:r>
-      <w:r>
-        <w:br/>
-      </w:r>
-      <w:r>
-        <w:rPr>
-          <w:rStyle w:val="CommentTok"/>
-        </w:rPr>
-        <w:t xml:space="preserve">        # 특정 시점 복구 (KST → UTC 변환 필요)</w:t>
-      </w:r>
-      <w:r>
-        <w:br/>
-      </w:r>
-      <w:r>
-        <w:rPr>
-          <w:rStyle w:val="AttributeTok"/>
-        </w:rPr>
-        <w:t xml:space="preserve">        </w:t>
-      </w:r>
-      <w:r>
-        <w:rPr>
-          <w:rStyle w:val="FunctionTok"/>
-        </w:rPr>
-        <w:t xml:space="preserve">targetTime</w:t>
-      </w:r>
-      <w:r>
-        <w:rPr>
-          <w:rStyle w:val="KeywordTok"/>
-        </w:rPr>
-        <w:t xml:space="preserve">:</w:t>
-      </w:r>
-      <w:r>
-        <w:rPr>
-          <w:rStyle w:val="AttributeTok"/>
-        </w:rPr>
-        <w:t xml:space="preserve"> </w:t>
-      </w:r>
-      <w:r>
-        <w:rPr>
-          <w:rStyle w:val="StringTok"/>
-        </w:rPr>
-        <w:t xml:space="preserve">"2026-04-22T18:00:00Z"</w:t>
-      </w:r>
-      <w:r>
-        <w:br/>
-      </w:r>
-      <w:r>
-        <w:rPr>
-          <w:rStyle w:val="CommentTok"/>
-        </w:rPr>
-        <w:t xml:space="preserve">        # 또는 특정 WAL LSN:</w:t>
-      </w:r>
-      <w:r>
-        <w:br/>
-      </w:r>
-      <w:r>
-        <w:rPr>
-          <w:rStyle w:val="CommentTok"/>
-        </w:rPr>
-        <w:t xml:space="preserve">        # targetLSN: "0/41000000"</w:t>
-      </w:r>
-      <w:r>
-        <w:br/>
-      </w:r>
-      <w:r>
-        <w:rPr>
-          <w:rStyle w:val="CommentTok"/>
-        </w:rPr>
-        <w:t xml:space="preserve">        # 또는 특정 백업 ID:</w:t>
-      </w:r>
-      <w:r>
-        <w:br/>
-      </w:r>
-      <w:r>
-        <w:rPr>
-          <w:rStyle w:val="CommentTok"/>
-        </w:rPr>
-        <w:t xml:space="preserve">        # backupID: "20260422T030000"</w:t>
-      </w:r>
-      <w:r>
-        <w:br/>
-      </w:r>
-      <w:r>
-        <w:rPr>
-          <w:rStyle w:val="AttributeTok"/>
-        </w:rPr>
-        <w:t xml:space="preserve">  </w:t>
-      </w:r>
-      <w:r>
-        <w:rPr>
-          <w:rStyle w:val="FunctionTok"/>
-        </w:rPr>
-        <w:t xml:space="preserve">externalClusters</w:t>
-      </w:r>
-      <w:r>
-        <w:rPr>
-          <w:rStyle w:val="KeywordTok"/>
-        </w:rPr>
-        <w:t xml:space="preserve">:</w:t>
-      </w:r>
-      <w:r>
-        <w:br/>
-      </w:r>
-      <w:r>
-        <w:rPr>
-          <w:rStyle w:val="AttributeTok"/>
-        </w:rPr>
-        <w:t xml:space="preserve">    </w:t>
-      </w:r>
-      <w:r>
-        <w:rPr>
-          <w:rStyle w:val="KeywordTok"/>
-        </w:rPr>
-        <w:t xml:space="preserve">-</w:t>
-      </w:r>
-      <w:r>
-        <w:rPr>
-          <w:rStyle w:val="AttributeTok"/>
-        </w:rPr>
-        <w:t xml:space="preserve"> </w:t>
-      </w:r>
-      <w:r>
-        <w:rPr>
-          <w:rStyle w:val="FunctionTok"/>
-        </w:rPr>
-        <w:t xml:space="preserve">name</w:t>
-      </w:r>
-      <w:r>
-        <w:rPr>
-          <w:rStyle w:val="KeywordTok"/>
-        </w:rPr>
-        <w:t xml:space="preserve">:</w:t>
-      </w:r>
-      <w:r>
-        <w:rPr>
-          <w:rStyle w:val="AttributeTok"/>
-        </w:rPr>
-        <w:t xml:space="preserve"> pg-main-backup</w:t>
-      </w:r>
-      <w:r>
-        <w:br/>
-      </w:r>
-      <w:r>
-        <w:rPr>
-          <w:rStyle w:val="AttributeTok"/>
-        </w:rPr>
-        <w:t xml:space="preserve">      </w:t>
-      </w:r>
-      <w:r>
-        <w:rPr>
-          <w:rStyle w:val="FunctionTok"/>
-        </w:rPr>
-        <w:t xml:space="preserve">barmanObjectStore</w:t>
-      </w:r>
-      <w:r>
-        <w:rPr>
-          <w:rStyle w:val="KeywordTok"/>
-        </w:rPr>
-        <w:t xml:space="preserve">:</w:t>
-      </w:r>
-      <w:r>
-        <w:br/>
-      </w:r>
-      <w:r>
-        <w:rPr>
-          <w:rStyle w:val="AttributeTok"/>
-        </w:rPr>
-        <w:t xml:space="preserve">        </w:t>
-      </w:r>
-      <w:r>
-        <w:rPr>
-          <w:rStyle w:val="FunctionTok"/>
-        </w:rPr>
-        <w:t xml:space="preserve">destinationPath</w:t>
-      </w:r>
-      <w:r>
-        <w:rPr>
-          <w:rStyle w:val="KeywordTok"/>
-        </w:rPr>
-        <w:t xml:space="preserve">:</w:t>
-      </w:r>
-      <w:r>
-        <w:rPr>
-          <w:rStyle w:val="AttributeTok"/>
-        </w:rPr>
-        <w:t xml:space="preserve"> </w:t>
-      </w:r>
-      <w:r>
-        <w:rPr>
-          <w:rStyle w:val="StringTok"/>
-        </w:rPr>
-        <w:t xml:space="preserve">"s3://pg-backups/pg-main"</w:t>
-      </w:r>
-      <w:r>
-        <w:br/>
-      </w:r>
-      <w:r>
-        <w:rPr>
-          <w:rStyle w:val="AttributeTok"/>
-        </w:rPr>
-        <w:t xml:space="preserve">        </w:t>
-      </w:r>
-      <w:r>
-        <w:rPr>
-          <w:rStyle w:val="FunctionTok"/>
-        </w:rPr>
-        <w:t xml:space="preserve">endpointURL</w:t>
-      </w:r>
-      <w:r>
-        <w:rPr>
-          <w:rStyle w:val="KeywordTok"/>
-        </w:rPr>
-        <w:t xml:space="preserve">:</w:t>
-      </w:r>
-      <w:r>
-        <w:rPr>
-          <w:rStyle w:val="AttributeTok"/>
-        </w:rPr>
-        <w:t xml:space="preserve"> </w:t>
-      </w:r>
-      <w:r>
-        <w:rPr>
-          <w:rStyle w:val="StringTok"/>
-        </w:rPr>
-        <w:t xml:space="preserve">"http://seaweedfs-s3.processing.svc.cluster.local:8333"</w:t>
-      </w:r>
-      <w:r>
-        <w:br/>
-      </w:r>
-      <w:r>
-        <w:rPr>
-          <w:rStyle w:val="AttributeTok"/>
-        </w:rPr>
-        <w:t xml:space="preserve">        </w:t>
-      </w:r>
-      <w:r>
-        <w:rPr>
-          <w:rStyle w:val="FunctionTok"/>
-        </w:rPr>
-        <w:t xml:space="preserve">s3Credentials</w:t>
-      </w:r>
-      <w:r>
-        <w:rPr>
-          <w:rStyle w:val="KeywordTok"/>
-        </w:rPr>
-        <w:t xml:space="preserve">:</w:t>
-      </w:r>
-      <w:r>
-        <w:br/>
-      </w:r>
-      <w:r>
-        <w:rPr>
-          <w:rStyle w:val="AttributeTok"/>
-        </w:rPr>
-        <w:t xml:space="preserve">          </w:t>
-      </w:r>
-      <w:r>
-        <w:rPr>
-          <w:rStyle w:val="FunctionTok"/>
-        </w:rPr>
-        <w:t xml:space="preserve">accessKeyId</w:t>
-      </w:r>
-      <w:r>
-        <w:rPr>
-          <w:rStyle w:val="KeywordTok"/>
-        </w:rPr>
-        <w:t xml:space="preserve">:</w:t>
-      </w:r>
-      <w:r>
-        <w:br/>
-      </w:r>
-      <w:r>
-        <w:rPr>
-          <w:rStyle w:val="AttributeTok"/>
-        </w:rPr>
-        <w:t xml:space="preserve">            </w:t>
-      </w:r>
-      <w:r>
-        <w:rPr>
-          <w:rStyle w:val="FunctionTok"/>
-        </w:rPr>
-        <w:t xml:space="preserve">name</w:t>
-      </w:r>
-      <w:r>
-        <w:rPr>
-          <w:rStyle w:val="KeywordTok"/>
-        </w:rPr>
-        <w:t xml:space="preserve">:</w:t>
-      </w:r>
-      <w:r>
-        <w:rPr>
-          <w:rStyle w:val="AttributeTok"/>
-        </w:rPr>
-        <w:t xml:space="preserve"> pg-backup-s3-creds</w:t>
-      </w:r>
-      <w:r>
-        <w:br/>
-      </w:r>
-      <w:r>
-        <w:rPr>
-          <w:rStyle w:val="AttributeTok"/>
-        </w:rPr>
-        <w:t xml:space="preserve">            </w:t>
-      </w:r>
-      <w:r>
-        <w:rPr>
-          <w:rStyle w:val="FunctionTok"/>
-        </w:rPr>
-        <w:t xml:space="preserve">key</w:t>
-      </w:r>
-      <w:r>
-        <w:rPr>
-          <w:rStyle w:val="KeywordTok"/>
-        </w:rPr>
-        <w:t xml:space="preserve">:</w:t>
-      </w:r>
-      <w:r>
-        <w:rPr>
-          <w:rStyle w:val="AttributeTok"/>
-        </w:rPr>
-        <w:t xml:space="preserve"> accessKeyId</w:t>
-      </w:r>
-      <w:r>
-        <w:br/>
-      </w:r>
-      <w:r>
-        <w:rPr>
-          <w:rStyle w:val="AttributeTok"/>
-        </w:rPr>
-        <w:t xml:space="preserve">          </w:t>
-      </w:r>
-      <w:r>
-        <w:rPr>
-          <w:rStyle w:val="FunctionTok"/>
-        </w:rPr>
-        <w:t xml:space="preserve">secretAccessKey</w:t>
-      </w:r>
-      <w:r>
-        <w:rPr>
-          <w:rStyle w:val="KeywordTok"/>
-        </w:rPr>
-        <w:t xml:space="preserve">:</w:t>
-      </w:r>
-      <w:r>
-        <w:br/>
-      </w:r>
-      <w:r>
-        <w:rPr>
-          <w:rStyle w:val="AttributeTok"/>
-        </w:rPr>
-        <w:t xml:space="preserve">            </w:t>
-      </w:r>
-      <w:r>
-        <w:rPr>
-          <w:rStyle w:val="FunctionTok"/>
-        </w:rPr>
-        <w:t xml:space="preserve">name</w:t>
-      </w:r>
-      <w:r>
-        <w:rPr>
-          <w:rStyle w:val="KeywordTok"/>
-        </w:rPr>
-        <w:t xml:space="preserve">:</w:t>
-      </w:r>
-      <w:r>
-        <w:rPr>
-          <w:rStyle w:val="AttributeTok"/>
-        </w:rPr>
-        <w:t xml:space="preserve"> pg-backup-s3-creds</w:t>
-      </w:r>
-      <w:r>
-        <w:br/>
-      </w:r>
-      <w:r>
-        <w:rPr>
-          <w:rStyle w:val="AttributeTok"/>
-        </w:rPr>
-        <w:t xml:space="preserve">            </w:t>
-      </w:r>
-      <w:r>
-        <w:rPr>
-          <w:rStyle w:val="FunctionTok"/>
-        </w:rPr>
-        <w:t xml:space="preserve">key</w:t>
-      </w:r>
-      <w:r>
-        <w:rPr>
-          <w:rStyle w:val="KeywordTok"/>
-        </w:rPr>
-        <w:t xml:space="preserve">:</w:t>
-      </w:r>
-      <w:r>
-        <w:rPr>
-          <w:rStyle w:val="AttributeTok"/>
-        </w:rPr>
-        <w:t xml:space="preserve"> secretAccessKey</w:t>
-      </w:r>
-      <w:r>
-        <w:br/>
-      </w:r>
-      <w:r>
-        <w:rPr>
-          <w:rStyle w:val="AttributeTok"/>
-        </w:rPr>
-        <w:t xml:space="preserve">        </w:t>
-      </w:r>
-      <w:r>
-        <w:rPr>
-          <w:rStyle w:val="FunctionTok"/>
-        </w:rPr>
-        <w:t xml:space="preserve">wal</w:t>
-      </w:r>
-      <w:r>
-        <w:rPr>
-          <w:rStyle w:val="KeywordTok"/>
-        </w:rPr>
-        <w:t xml:space="preserve">:</w:t>
-      </w:r>
-      <w:r>
-        <w:br/>
-      </w:r>
-      <w:r>
-        <w:rPr>
-          <w:rStyle w:val="AttributeTok"/>
-        </w:rPr>
-        <w:t xml:space="preserve">          </w:t>
-      </w:r>
-      <w:r>
-        <w:rPr>
-          <w:rStyle w:val="FunctionTok"/>
-        </w:rPr>
-        <w:t xml:space="preserve">maxParallel</w:t>
-      </w:r>
-      <w:r>
-        <w:rPr>
-          <w:rStyle w:val="KeywordTok"/>
-        </w:rPr>
-        <w:t xml:space="preserve">:</w:t>
-      </w:r>
-      <w:r>
-        <w:rPr>
-          <w:rStyle w:val="AttributeTok"/>
-        </w:rPr>
-        <w:t xml:space="preserve"> </w:t>
-      </w:r>
-      <w:r>
-        <w:rPr>
-          <w:rStyle w:val="DecValTok"/>
-        </w:rPr>
-        <w:t xml:space="preserve">2</w:t>
-      </w:r>
-    </w:p>
-    <w:bookmarkEnd w:id="18"/>
-    <w:bookmarkStart w:id="19" w:name="X87d19ab5fb5291ae609f18a3804a88a73eff9c3"/>
-    <w:p>
-      <w:pPr>
-        <w:pStyle w:val="Heading3"/>
-      </w:pPr>
-      <w:r>
-        <w:t xml:space="preserve">5.3 복구 실행</w:t>
-      </w:r>
-    </w:p>
-    <w:p>
-      <w:pPr>
-        <w:pStyle w:val="SourceCode"/>
-      </w:pPr>
-      <w:r>
-        <w:rPr>
-          <w:rStyle w:val="CommentTok"/>
-        </w:rPr>
-        <w:t xml:space="preserve"># 1. Secret 확인 (이미 있어야 함)</w:t>
-      </w:r>
-      <w:r>
-        <w:br/>
-      </w:r>
-      <w:r>
-        <w:rPr>
-          <w:rStyle w:val="ExtensionTok"/>
-        </w:rPr>
-        <w:t xml:space="preserve">kubectl</w:t>
-      </w:r>
-      <w:r>
-        <w:rPr>
-          <w:rStyle w:val="NormalTok"/>
-        </w:rPr>
-        <w:t xml:space="preserve"> </w:t>
-      </w:r>
-      <w:r>
-        <w:rPr>
-          <w:rStyle w:val="AttributeTok"/>
-        </w:rPr>
-        <w:t xml:space="preserve">-n</w:t>
-      </w:r>
-      <w:r>
-        <w:rPr>
-          <w:rStyle w:val="NormalTok"/>
-        </w:rPr>
-        <w:t xml:space="preserve"> processing get secret pg-backup-s3-creds</w:t>
-      </w:r>
-      <w:r>
-        <w:br/>
-      </w:r>
-      <w:r>
-        <w:br/>
-      </w:r>
-      <w:r>
-        <w:rPr>
-          <w:rStyle w:val="CommentTok"/>
-        </w:rPr>
-        <w:t xml:space="preserve"># 2. 복구 Cluster 적용</w:t>
-      </w:r>
-      <w:r>
-        <w:br/>
-      </w:r>
-      <w:r>
-        <w:rPr>
-          <w:rStyle w:val="ExtensionTok"/>
-        </w:rPr>
-        <w:t xml:space="preserve">kubectl</w:t>
-      </w:r>
-      <w:r>
-        <w:rPr>
-          <w:rStyle w:val="NormalTok"/>
-        </w:rPr>
-        <w:t xml:space="preserve"> apply </w:t>
-      </w:r>
-      <w:r>
-        <w:rPr>
-          <w:rStyle w:val="AttributeTok"/>
-        </w:rPr>
-        <w:t xml:space="preserve">-f</w:t>
-      </w:r>
-      <w:r>
-        <w:rPr>
-          <w:rStyle w:val="NormalTok"/>
-        </w:rPr>
-        <w:t xml:space="preserve"> pg-main-restore.yaml</w:t>
-      </w:r>
-      <w:r>
-        <w:br/>
-      </w:r>
-      <w:r>
-        <w:br/>
-      </w:r>
-      <w:r>
-        <w:rPr>
-          <w:rStyle w:val="CommentTok"/>
-        </w:rPr>
-        <w:t xml:space="preserve"># 3. 복구 완료 대기</w:t>
-      </w:r>
-      <w:r>
-        <w:br/>
-      </w:r>
-      <w:r>
-        <w:rPr>
-          <w:rStyle w:val="ExtensionTok"/>
-        </w:rPr>
-        <w:t xml:space="preserve">kubectl</w:t>
-      </w:r>
-      <w:r>
-        <w:rPr>
-          <w:rStyle w:val="NormalTok"/>
-        </w:rPr>
-        <w:t xml:space="preserve"> </w:t>
-      </w:r>
-      <w:r>
-        <w:rPr>
-          <w:rStyle w:val="AttributeTok"/>
-        </w:rPr>
-        <w:t xml:space="preserve">-n</w:t>
-      </w:r>
-      <w:r>
-        <w:rPr>
-          <w:rStyle w:val="NormalTok"/>
-        </w:rPr>
-        <w:t xml:space="preserve"> processing wait </w:t>
-      </w:r>
-      <w:r>
-        <w:rPr>
-          <w:rStyle w:val="AttributeTok"/>
-        </w:rPr>
-        <w:t xml:space="preserve">--for</w:t>
-      </w:r>
-      <w:r>
-        <w:rPr>
-          <w:rStyle w:val="OperatorTok"/>
-        </w:rPr>
-        <w:t xml:space="preserve">=</w:t>
-      </w:r>
-      <w:r>
-        <w:rPr>
-          <w:rStyle w:val="NormalTok"/>
-        </w:rPr>
-        <w:t xml:space="preserve">condition=Ready </w:t>
-      </w:r>
-      <w:r>
-        <w:rPr>
-          <w:rStyle w:val="DataTypeTok"/>
-        </w:rPr>
-        <w:t xml:space="preserve">\</w:t>
-      </w:r>
-      <w:r>
-        <w:br/>
-      </w:r>
-      <w:r>
-        <w:rPr>
-          <w:rStyle w:val="NormalTok"/>
-        </w:rPr>
-        <w:t xml:space="preserve">  cluster/pg-main-restore </w:t>
-      </w:r>
-      <w:r>
-        <w:rPr>
-          <w:rStyle w:val="AttributeTok"/>
-        </w:rPr>
-        <w:t xml:space="preserve">--timeout</w:t>
-      </w:r>
-      <w:r>
-        <w:rPr>
-          <w:rStyle w:val="OperatorTok"/>
-        </w:rPr>
-        <w:t xml:space="preserve">=</w:t>
-      </w:r>
-      <w:r>
-        <w:rPr>
-          <w:rStyle w:val="NormalTok"/>
-        </w:rPr>
-        <w:t xml:space="preserve">600s</w:t>
-      </w:r>
-      <w:r>
-        <w:br/>
-      </w:r>
-      <w:r>
-        <w:br/>
-      </w:r>
-      <w:r>
-        <w:rPr>
-          <w:rStyle w:val="CommentTok"/>
-        </w:rPr>
-        <w:t xml:space="preserve"># 4. 데이터 검증</w:t>
-      </w:r>
-      <w:r>
-        <w:br/>
-      </w:r>
-      <w:r>
-        <w:rPr>
-          <w:rStyle w:val="ExtensionTok"/>
-        </w:rPr>
-        <w:t xml:space="preserve">kubectl</w:t>
-      </w:r>
-      <w:r>
-        <w:rPr>
-          <w:rStyle w:val="NormalTok"/>
-        </w:rPr>
-        <w:t xml:space="preserve"> </w:t>
-      </w:r>
-      <w:r>
-        <w:rPr>
-          <w:rStyle w:val="AttributeTok"/>
-        </w:rPr>
-        <w:t xml:space="preserve">-n</w:t>
-      </w:r>
-      <w:r>
-        <w:rPr>
-          <w:rStyle w:val="NormalTok"/>
-        </w:rPr>
-        <w:t xml:space="preserve"> processing exec pg-main-restore-1 </w:t>
-      </w:r>
-      <w:r>
-        <w:rPr>
-          <w:rStyle w:val="AttributeTok"/>
-        </w:rPr>
-        <w:t xml:space="preserve">-c</w:t>
-      </w:r>
-      <w:r>
-        <w:rPr>
-          <w:rStyle w:val="NormalTok"/>
-        </w:rPr>
-        <w:t xml:space="preserve"> postgres </w:t>
-      </w:r>
-      <w:r>
-        <w:rPr>
-          <w:rStyle w:val="AttributeTok"/>
-        </w:rPr>
-        <w:t xml:space="preserve">--</w:t>
-      </w:r>
-      <w:r>
-        <w:rPr>
-          <w:rStyle w:val="NormalTok"/>
-        </w:rPr>
-        <w:t xml:space="preserve"> </w:t>
-      </w:r>
-      <w:r>
-        <w:rPr>
-          <w:rStyle w:val="DataTypeTok"/>
-        </w:rPr>
-        <w:t xml:space="preserve">\</w:t>
-      </w:r>
-      <w:r>
-        <w:br/>
-      </w:r>
-      <w:r>
-        <w:rPr>
-          <w:rStyle w:val="NormalTok"/>
-        </w:rPr>
-        <w:t xml:space="preserve">  psql </w:t>
-      </w:r>
-      <w:r>
-        <w:rPr>
-          <w:rStyle w:val="AttributeTok"/>
-        </w:rPr>
-        <w:t xml:space="preserve">-U</w:t>
-      </w:r>
-      <w:r>
-        <w:rPr>
-          <w:rStyle w:val="NormalTok"/>
-        </w:rPr>
-        <w:t xml:space="preserve"> postgres </w:t>
-      </w:r>
-      <w:r>
-        <w:rPr>
-          <w:rStyle w:val="AttributeTok"/>
-        </w:rPr>
-        <w:t xml:space="preserve">-d</w:t>
-      </w:r>
-      <w:r>
-        <w:rPr>
-          <w:rStyle w:val="NormalTok"/>
-        </w:rPr>
-        <w:t xml:space="preserve"> ocr </w:t>
-      </w:r>
-      <w:r>
-        <w:rPr>
-          <w:rStyle w:val="AttributeTok"/>
-        </w:rPr>
-        <w:t xml:space="preserve">-c</w:t>
-      </w:r>
-      <w:r>
-        <w:rPr>
-          <w:rStyle w:val="NormalTok"/>
-        </w:rPr>
-        <w:t xml:space="preserve"> </w:t>
-      </w:r>
-      <w:r>
-        <w:rPr>
-          <w:rStyle w:val="StringTok"/>
-        </w:rPr>
-        <w:t xml:space="preserve">"SELECT count(*) FROM &lt;핵심 테이블&gt;;"</w:t>
-      </w:r>
-      <w:r>
-        <w:br/>
-      </w:r>
-      <w:r>
-        <w:br/>
-      </w:r>
-      <w:r>
-        <w:rPr>
-          <w:rStyle w:val="CommentTok"/>
-        </w:rPr>
-        <w:t xml:space="preserve"># 5. (선택) 서비스 전환 — pg-main Service가 pg-main-restore를 가리키도록 변경</w:t>
-      </w:r>
-      <w:r>
-        <w:br/>
-      </w:r>
-      <w:r>
-        <w:rPr>
-          <w:rStyle w:val="CommentTok"/>
-        </w:rPr>
-        <w:t xml:space="preserve">#    또는 pg-main 삭제 후 pg-main-restore를 pg-main으로 rename (PVC 유지 주의)</w:t>
-      </w:r>
-    </w:p>
-    <w:p>
-      <w:pPr>
-        <w:pStyle w:val="BlockText"/>
-      </w:pPr>
-      <w:r>
-        <w:rPr>
-          <w:b/>
-          <w:bCs/>
-        </w:rPr>
-        <w:t xml:space="preserve">주의</w:t>
-      </w:r>
-      <w:r>
-        <w:t xml:space="preserve">: 복구 Cluster는 기존</w:t>
-      </w:r>
-      <w:r>
-        <w:t xml:space="preserve"> </w:t>
-      </w:r>
-      <w:r>
-        <w:rPr>
-          <w:rStyle w:val="VerbatimChar"/>
-        </w:rPr>
-        <w:t xml:space="preserve">pg-main</w:t>
-      </w:r>
-      <w:r>
-        <w:t xml:space="preserve">과</w:t>
-      </w:r>
-      <w:r>
-        <w:t xml:space="preserve"> </w:t>
-      </w:r>
-      <w:r>
-        <w:rPr>
-          <w:b/>
-          <w:bCs/>
-        </w:rPr>
-        <w:t xml:space="preserve">동시에 존재</w:t>
-      </w:r>
-      <w:r>
-        <w:t xml:space="preserve"> </w:t>
-      </w:r>
-      <w:r>
-        <w:t xml:space="preserve">가능.</w:t>
-      </w:r>
-      <w:r>
-        <w:t xml:space="preserve"> </w:t>
-      </w:r>
-      <w:r>
-        <w:t xml:space="preserve">검증 완료 후 기존 클러스터 삭제 여부를 수동으로 결정할 것.</w:t>
-      </w:r>
-    </w:p>
-    <w:bookmarkEnd w:id="19"/>
-    <w:bookmarkStart w:id="20" w:name="X2f23ed36f6d8f183452f50300e1abe9fdf27dea"/>
-    <w:p>
-      <w:pPr>
-        <w:pStyle w:val="Heading3"/>
-      </w:pPr>
-      <w:r>
-        <w:t xml:space="preserve">5.4 복구 후 정리</w:t>
-      </w:r>
-    </w:p>
-    <w:p>
-      <w:pPr>
-        <w:pStyle w:val="SourceCode"/>
-      </w:pPr>
-      <w:r>
-        <w:rPr>
-          <w:rStyle w:val="CommentTok"/>
-        </w:rPr>
-        <w:t xml:space="preserve"># 검증 완료 시 복구 클러스터 삭제</w:t>
-      </w:r>
-      <w:r>
-        <w:br/>
-      </w:r>
-      <w:r>
-        <w:rPr>
-          <w:rStyle w:val="ExtensionTok"/>
-        </w:rPr>
-        <w:t xml:space="preserve">kubectl</w:t>
-      </w:r>
-      <w:r>
-        <w:rPr>
-          <w:rStyle w:val="NormalTok"/>
-        </w:rPr>
-        <w:t xml:space="preserve"> </w:t>
-      </w:r>
-      <w:r>
-        <w:rPr>
-          <w:rStyle w:val="AttributeTok"/>
-        </w:rPr>
-        <w:t xml:space="preserve">-n</w:t>
-      </w:r>
-      <w:r>
-        <w:rPr>
-          <w:rStyle w:val="NormalTok"/>
-        </w:rPr>
-        <w:t xml:space="preserve"> processing delete cluster pg-main-restore</w:t>
-      </w:r>
-    </w:p>
-    <w:p>
-      <w:r>
-        <w:pict>
-          <v:rect style="width:0;height:1.5pt" o:hralign="center" o:hrstd="t" o:hr="t"/>
-        </w:pict>
-      </w:r>
-    </w:p>
-    <w:bookmarkEnd w:id="20"/>
-    <w:bookmarkEnd w:id="21"/>
-    <w:bookmarkStart w:id="25" w:name="X13b1f98c6d083fd998b8d76cb2dcf5c4afa25f4"/>
-    <w:p>
-      <w:pPr>
-        <w:pStyle w:val="Heading2"/>
-      </w:pPr>
-      <w:r>
-        <w:t xml:space="preserve">6. 장애 대응 시나리오</w:t>
-      </w:r>
-    </w:p>
-    <w:bookmarkStart w:id="22" w:name="Xac14be6231098aab186dfc612ea5bf3fd20023a"/>
-    <w:p>
-      <w:pPr>
-        <w:pStyle w:val="Heading3"/>
-      </w:pPr>
-      <w:r>
-        <w:t xml:space="preserve">6.1 WAL 아카이빙 실패</w:t>
-      </w:r>
-    </w:p>
-    <w:p>
-      <w:pPr>
-        <w:pStyle w:val="FirstParagraph"/>
-      </w:pPr>
-      <w:r>
-        <w:rPr>
-          <w:b/>
-          <w:bCs/>
-        </w:rPr>
-        <w:t xml:space="preserve">증상</w:t>
-      </w:r>
-      <w:r>
-        <w:t xml:space="preserve">:</w:t>
-      </w:r>
-      <w:r>
-        <w:t xml:space="preserve"> </w:t>
-      </w:r>
-      <w:r>
-        <w:rPr>
-          <w:rStyle w:val="VerbatimChar"/>
-        </w:rPr>
-        <w:t xml:space="preserve">pg_stat_archiver.failed_count &gt; 0</w:t>
-      </w:r>
-      <w:r>
-        <w:t xml:space="preserve"> </w:t>
-      </w:r>
-      <w:r>
-        <w:t xml:space="preserve">또는</w:t>
-      </w:r>
-      <w:r>
-        <w:t xml:space="preserve"> </w:t>
-      </w:r>
-      <w:r>
-        <w:rPr>
-          <w:rStyle w:val="VerbatimChar"/>
-        </w:rPr>
-        <w:t xml:space="preserve">ContinuousArchiving: False</w:t>
-      </w:r>
-    </w:p>
-    <w:p>
-      <w:pPr>
-        <w:pStyle w:val="BodyText"/>
-      </w:pPr>
-      <w:r>
-        <w:rPr>
-          <w:b/>
-          <w:bCs/>
-        </w:rPr>
-        <w:t xml:space="preserve">원인 확인</w:t>
-      </w:r>
-      <w:r>
-        <w:t xml:space="preserve">:</w:t>
-      </w:r>
-    </w:p>
-    <w:p>
-      <w:pPr>
-        <w:pStyle w:val="SourceCode"/>
-      </w:pPr>
-      <w:r>
-        <w:rPr>
-          <w:rStyle w:val="CommentTok"/>
-        </w:rPr>
-        <w:t xml:space="preserve"># CNPG 컨트롤러 로그</w:t>
-      </w:r>
-      <w:r>
-        <w:br/>
-      </w:r>
-      <w:r>
-        <w:rPr>
-          <w:rStyle w:val="ExtensionTok"/>
-        </w:rPr>
-        <w:t xml:space="preserve">kubectl</w:t>
-      </w:r>
-      <w:r>
-        <w:rPr>
-          <w:rStyle w:val="NormalTok"/>
-        </w:rPr>
-        <w:t xml:space="preserve"> </w:t>
-      </w:r>
-      <w:r>
-        <w:rPr>
-          <w:rStyle w:val="AttributeTok"/>
-        </w:rPr>
-        <w:t xml:space="preserve">-n</w:t>
-      </w:r>
-      <w:r>
-        <w:rPr>
-          <w:rStyle w:val="NormalTok"/>
-        </w:rPr>
-        <w:t xml:space="preserve"> cnpg-system logs </w:t>
-      </w:r>
-      <w:r>
-        <w:rPr>
-          <w:rStyle w:val="AttributeTok"/>
-        </w:rPr>
-        <w:t xml:space="preserve">-l</w:t>
-      </w:r>
-      <w:r>
-        <w:rPr>
-          <w:rStyle w:val="NormalTok"/>
-        </w:rPr>
-        <w:t xml:space="preserve"> app.kubernetes.io/name=cloudnative-pg </w:t>
-      </w:r>
-      <w:r>
-        <w:rPr>
-          <w:rStyle w:val="AttributeTok"/>
-        </w:rPr>
-        <w:t xml:space="preserve">--tail</w:t>
-      </w:r>
-      <w:r>
-        <w:rPr>
-          <w:rStyle w:val="OperatorTok"/>
-        </w:rPr>
-        <w:t xml:space="preserve">=</w:t>
-      </w:r>
-      <w:r>
-        <w:rPr>
-          <w:rStyle w:val="NormalTok"/>
-        </w:rPr>
-        <w:t xml:space="preserve">50</w:t>
-      </w:r>
-      <w:r>
-        <w:br/>
-      </w:r>
-      <w:r>
-        <w:br/>
-      </w:r>
-      <w:r>
-        <w:rPr>
-          <w:rStyle w:val="CommentTok"/>
-        </w:rPr>
-        <w:t xml:space="preserve"># pg-main-1 pod 내 barman-cloud-wal-archive 로그</w:t>
-      </w:r>
-      <w:r>
-        <w:br/>
-      </w:r>
-      <w:r>
-        <w:rPr>
-          <w:rStyle w:val="ExtensionTok"/>
-        </w:rPr>
-        <w:t xml:space="preserve">kubectl</w:t>
-      </w:r>
-      <w:r>
-        <w:rPr>
-          <w:rStyle w:val="NormalTok"/>
-        </w:rPr>
-        <w:t xml:space="preserve"> </w:t>
-      </w:r>
-      <w:r>
-        <w:rPr>
-          <w:rStyle w:val="AttributeTok"/>
-        </w:rPr>
-        <w:t xml:space="preserve">-n</w:t>
-      </w:r>
-      <w:r>
-        <w:rPr>
-          <w:rStyle w:val="NormalTok"/>
-        </w:rPr>
-        <w:t xml:space="preserve"> processing logs pg-main-1 </w:t>
-      </w:r>
-      <w:r>
-        <w:rPr>
-          <w:rStyle w:val="AttributeTok"/>
-        </w:rPr>
-        <w:t xml:space="preserve">-c</w:t>
-      </w:r>
-      <w:r>
-        <w:rPr>
-          <w:rStyle w:val="NormalTok"/>
-        </w:rPr>
-        <w:t xml:space="preserve"> postgres </w:t>
-      </w:r>
-      <w:r>
-        <w:rPr>
-          <w:rStyle w:val="AttributeTok"/>
-        </w:rPr>
-        <w:t xml:space="preserve">--tail</w:t>
-      </w:r>
-      <w:r>
-        <w:rPr>
-          <w:rStyle w:val="OperatorTok"/>
-        </w:rPr>
-        <w:t xml:space="preserve">=</w:t>
-      </w:r>
-      <w:r>
-        <w:rPr>
-          <w:rStyle w:val="NormalTok"/>
-        </w:rPr>
-        <w:t xml:space="preserve">100 </w:t>
-      </w:r>
-      <w:r>
-        <w:rPr>
-          <w:rStyle w:val="KeywordTok"/>
-        </w:rPr>
-        <w:t xml:space="preserve">|</w:t>
-      </w:r>
-      <w:r>
-        <w:rPr>
-          <w:rStyle w:val="NormalTok"/>
-        </w:rPr>
-        <w:t xml:space="preserve"> </w:t>
-      </w:r>
-      <w:r>
-        <w:rPr>
-          <w:rStyle w:val="FunctionTok"/>
-        </w:rPr>
-        <w:t xml:space="preserve">grep</w:t>
-      </w:r>
-      <w:r>
-        <w:rPr>
-          <w:rStyle w:val="NormalTok"/>
-        </w:rPr>
-        <w:t xml:space="preserve"> </w:t>
-      </w:r>
-      <w:r>
-        <w:rPr>
-          <w:rStyle w:val="AttributeTok"/>
-        </w:rPr>
-        <w:t xml:space="preserve">-i</w:t>
-      </w:r>
-      <w:r>
-        <w:rPr>
-          <w:rStyle w:val="NormalTok"/>
-        </w:rPr>
-        <w:t xml:space="preserve"> </w:t>
-      </w:r>
-      <w:r>
-        <w:rPr>
-          <w:rStyle w:val="StringTok"/>
-        </w:rPr>
-        <w:t xml:space="preserve">"barman\|archive\|error"</w:t>
-      </w:r>
-    </w:p>
-    <w:p>
-      <w:pPr>
-        <w:pStyle w:val="FirstParagraph"/>
-      </w:pPr>
-      <w:r>
-        <w:rPr>
-          <w:b/>
-          <w:bCs/>
-        </w:rPr>
-        <w:t xml:space="preserve">대응</w:t>
-      </w:r>
-      <w:r>
-        <w:t xml:space="preserve">:</w:t>
-      </w:r>
-    </w:p>
-    <w:p>
-      <w:pPr>
-        <w:pStyle w:val="Compact"/>
-        <w:numPr>
-          <w:ilvl w:val="0"/>
-          <w:numId w:val="1003"/>
-        </w:numPr>
-      </w:pPr>
-      <w:r>
-        <w:t xml:space="preserve">SeaweedFS S3 서비스 상태 확인:</w:t>
-      </w:r>
-      <w:r>
-        <w:t xml:space="preserve"> </w:t>
-      </w:r>
-      <w:r>
-        <w:rPr>
-          <w:rStyle w:val="VerbatimChar"/>
-        </w:rPr>
-        <w:t xml:space="preserve">kubectl -n processing get pod -l app.kubernetes.io/name=seaweedfs</w:t>
-      </w:r>
-    </w:p>
-    <w:p>
-      <w:pPr>
-        <w:pStyle w:val="Compact"/>
-        <w:numPr>
-          <w:ilvl w:val="0"/>
-          <w:numId w:val="1003"/>
-        </w:numPr>
-      </w:pPr>
-      <w:r>
-        <w:t xml:space="preserve">Secret 자격증명 확인:</w:t>
-      </w:r>
-      <w:r>
-        <w:t xml:space="preserve"> </w:t>
-      </w:r>
-      <w:r>
-        <w:rPr>
-          <w:rStyle w:val="VerbatimChar"/>
-        </w:rPr>
-        <w:t xml:space="preserve">kubectl -n processing get secret pg-backup-s3-creds -o jsonpath='{.data.accessKeyId}' | base64 -d</w:t>
-      </w:r>
-    </w:p>
-    <w:p>
-      <w:pPr>
-        <w:pStyle w:val="Compact"/>
-        <w:numPr>
-          <w:ilvl w:val="0"/>
-          <w:numId w:val="1003"/>
-        </w:numPr>
-      </w:pPr>
-      <w:r>
-        <w:t xml:space="preserve">버킷 존재 확인 (§3.4 참조)</w:t>
-      </w:r>
-    </w:p>
-    <w:p>
-      <w:pPr>
-        <w:pStyle w:val="Compact"/>
-        <w:numPr>
-          <w:ilvl w:val="0"/>
-          <w:numId w:val="1003"/>
-        </w:numPr>
-      </w:pPr>
-      <w:r>
-        <w:t xml:space="preserve">NetworkPolicy 확인:</w:t>
-      </w:r>
-      <w:r>
-        <w:t xml:space="preserve"> </w:t>
-      </w:r>
-      <w:r>
-        <w:rPr>
-          <w:rStyle w:val="VerbatimChar"/>
-        </w:rPr>
-        <w:t xml:space="preserve">kubectl -n processing get networkpolicy allow-intra-namespace</w:t>
-      </w:r>
-    </w:p>
-    <w:bookmarkEnd w:id="22"/>
-    <w:bookmarkStart w:id="23" w:name="X3261559a5a1bf40ccb56fbee162171575b3962c"/>
-    <w:p>
-      <w:pPr>
-        <w:pStyle w:val="Heading3"/>
-      </w:pPr>
-      <w:r>
-        <w:t xml:space="preserve">6.2 ScheduledBackup 미실행</w:t>
-      </w:r>
-    </w:p>
-    <w:p>
-      <w:pPr>
-        <w:pStyle w:val="FirstParagraph"/>
-      </w:pPr>
-      <w:r>
-        <w:rPr>
-          <w:b/>
-          <w:bCs/>
-        </w:rPr>
-        <w:t xml:space="preserve">증상</w:t>
-      </w:r>
-      <w:r>
-        <w:t xml:space="preserve">:</w:t>
-      </w:r>
-      <w:r>
-        <w:t xml:space="preserve"> </w:t>
-      </w:r>
-      <w:r>
-        <w:rPr>
-          <w:rStyle w:val="VerbatimChar"/>
-        </w:rPr>
-        <w:t xml:space="preserve">kubectl -n processing get scheduledbackup pg-main-daily</w:t>
-      </w:r>
-      <w:r>
-        <w:t xml:space="preserve"> </w:t>
-      </w:r>
-      <w:r>
-        <w:t xml:space="preserve">의</w:t>
-      </w:r>
-      <w:r>
-        <w:t xml:space="preserve"> </w:t>
-      </w:r>
-      <w:r>
-        <w:rPr>
-          <w:rStyle w:val="VerbatimChar"/>
-        </w:rPr>
-        <w:t xml:space="preserve">lastBackupTime</w:t>
-      </w:r>
-      <w:r>
-        <w:t xml:space="preserve"> </w:t>
-      </w:r>
-      <w:r>
-        <w:t xml:space="preserve">갱신 안 됨</w:t>
-      </w:r>
-    </w:p>
-    <w:p>
-      <w:pPr>
-        <w:pStyle w:val="BodyText"/>
-      </w:pPr>
-      <w:r>
-        <w:rPr>
-          <w:b/>
-          <w:bCs/>
-        </w:rPr>
-        <w:t xml:space="preserve">원인 확인</w:t>
-      </w:r>
-      <w:r>
-        <w:t xml:space="preserve">:</w:t>
-      </w:r>
-    </w:p>
-    <w:p>
-      <w:pPr>
-        <w:pStyle w:val="SourceCode"/>
-      </w:pPr>
-      <w:r>
-        <w:rPr>
-          <w:rStyle w:val="ExtensionTok"/>
-        </w:rPr>
-        <w:t xml:space="preserve">kubectl</w:t>
-      </w:r>
-      <w:r>
-        <w:rPr>
-          <w:rStyle w:val="NormalTok"/>
-        </w:rPr>
-        <w:t xml:space="preserve"> </w:t>
-      </w:r>
-      <w:r>
-        <w:rPr>
-          <w:rStyle w:val="AttributeTok"/>
-        </w:rPr>
-        <w:t xml:space="preserve">-n</w:t>
-      </w:r>
-      <w:r>
-        <w:rPr>
-          <w:rStyle w:val="NormalTok"/>
-        </w:rPr>
-        <w:t xml:space="preserve"> processing describe scheduledbackup pg-main-daily</w:t>
-      </w:r>
-    </w:p>
-    <w:p>
-      <w:pPr>
-        <w:pStyle w:val="FirstParagraph"/>
-      </w:pPr>
-      <w:r>
-        <w:rPr>
-          <w:b/>
-          <w:bCs/>
-        </w:rPr>
-        <w:t xml:space="preserve">대응</w:t>
-      </w:r>
-      <w:r>
-        <w:t xml:space="preserve">: 수동 백업 실행 (§4) 후 스케줄 설정 재검토.</w:t>
-      </w:r>
-    </w:p>
-    <w:bookmarkEnd w:id="23"/>
-    <w:bookmarkStart w:id="24" w:name="X8e0b6a1530d680824839105aec2b58c21b43f14"/>
-    <w:p>
-      <w:pPr>
-        <w:pStyle w:val="Heading3"/>
-      </w:pPr>
-      <w:r>
-        <w:t xml:space="preserve">6.3 SeaweedFS S3 다운</w:t>
-      </w:r>
-    </w:p>
-    <w:p>
-      <w:pPr>
-        <w:pStyle w:val="FirstParagraph"/>
-      </w:pPr>
-      <w:r>
-        <w:rPr>
-          <w:b/>
-          <w:bCs/>
-        </w:rPr>
-        <w:t xml:space="preserve">임시 조치</w:t>
-      </w:r>
-      <w:r>
-        <w:t xml:space="preserve">: WAL은 로컬에 누적됨 (</w:t>
-      </w:r>
-      <w:r>
-        <w:rPr>
-          <w:rStyle w:val="VerbatimChar"/>
-        </w:rPr>
-        <w:t xml:space="preserve">wal_keep_size: 512MB</w:t>
-      </w:r>
-      <w:r>
-        <w:t xml:space="preserve">). 서비스 복구 후 자동 재전송.</w:t>
-      </w:r>
-      <w:r>
-        <w:t xml:space="preserve"> </w:t>
-      </w:r>
-      <w:r>
-        <w:rPr>
-          <w:b/>
-          <w:bCs/>
-        </w:rPr>
-        <w:t xml:space="preserve">장기 조치</w:t>
-      </w:r>
-      <w:r>
-        <w:t xml:space="preserve">: SeaweedFS 복구 절차 (</w:t>
-      </w:r>
-      <w:r>
-        <w:rPr>
-          <w:rStyle w:val="VerbatimChar"/>
-        </w:rPr>
-        <w:t xml:space="preserve">docs/ops/seaweedfs-recovery.md</w:t>
-      </w:r>
-      <w:r>
-        <w:t xml:space="preserve"> </w:t>
-      </w:r>
-      <w:r>
-        <w:t xml:space="preserve">참조 — 미작성).</w:t>
-      </w:r>
-    </w:p>
-    <w:p>
-      <w:r>
-        <w:pict>
-          <v:rect style="width:0;height:1.5pt" o:hralign="center" o:hrstd="t" o:hr="t"/>
-        </w:pict>
-      </w:r>
-    </w:p>
-    <w:bookmarkEnd w:id="24"/>
-    <w:bookmarkEnd w:id="25"/>
-    <w:bookmarkStart w:id="26" w:name="X4f60b94f28329927eb86280aecae17250ae58e3"/>
-    <w:p>
-      <w:pPr>
-        <w:pStyle w:val="Heading2"/>
-      </w:pPr>
-      <w:r>
-        <w:t xml:space="preserve">7. 운영 체크리스트 (일별)</w:t>
-      </w:r>
-    </w:p>
-    <w:p>
-      <w:pPr>
-        <w:pStyle w:val="Compact"/>
-        <w:numPr>
-          <w:ilvl w:val="0"/>
-          <w:numId w:val="1004"/>
-        </w:numPr>
-      </w:pPr>
-      <w:r>
-        <w:rPr>
-          <w:rStyle w:val="VerbatimChar"/>
-        </w:rPr>
-        <w:t xml:space="preserve">pg_stat_archiver.failed_count = 0</w:t>
-      </w:r>
-      <w:r>
-        <w:t xml:space="preserve"> </w:t>
-      </w:r>
-      <w:r>
-        <w:t xml:space="preserve">확인</w:t>
-      </w:r>
-    </w:p>
-    <w:p>
-      <w:pPr>
-        <w:pStyle w:val="Compact"/>
-        <w:numPr>
-          <w:ilvl w:val="0"/>
-          <w:numId w:val="1005"/>
-        </w:numPr>
-      </w:pPr>
-      <w:r>
-        <w:t xml:space="preserve">전날 ScheduledBackup</w:t>
-      </w:r>
-      <w:r>
-        <w:t xml:space="preserve"> </w:t>
-      </w:r>
-      <w:r>
-        <w:rPr>
-          <w:rStyle w:val="VerbatimChar"/>
-        </w:rPr>
-        <w:t xml:space="preserve">phase=completed</w:t>
-      </w:r>
-      <w:r>
-        <w:t xml:space="preserve"> </w:t>
-      </w:r>
-      <w:r>
-        <w:t xml:space="preserve">확인</w:t>
-      </w:r>
-    </w:p>
-    <w:p>
-      <w:pPr>
-        <w:pStyle w:val="Compact"/>
-        <w:numPr>
-          <w:ilvl w:val="0"/>
-          <w:numId w:val="1006"/>
-        </w:numPr>
-      </w:pPr>
-      <w:r>
-        <w:t xml:space="preserve">S3 버킷 사용량 모니터링 (SeaweedFS 용량 대비 14일치 보존)</w:t>
-      </w:r>
-    </w:p>
-    <w:p>
-      <w:r>
-        <w:pict>
-          <v:rect style="width:0;height:1.5pt" o:hralign="center" o:hrstd="t" o:hr="t"/>
-        </w:pict>
-      </w:r>
-    </w:p>
-    <w:bookmarkEnd w:id="26"/>
-    <w:bookmarkStart w:id="27" w:name="X024a3e956722d6bca8e241849abb4b159eeac44"/>
-    <w:p>
-      <w:pPr>
-        <w:pStyle w:val="Heading2"/>
-      </w:pPr>
-      <w:r>
-        <w:t xml:space="preserve">8. 관련 파일</w:t>
+        <w:t xml:space="preserve">5. PITR Dry-Run 검증 결과 (2026-04-23)</w:t>
       </w:r>
     </w:p>
     <w:tbl>
@@ -4152,6 +1953,2688 @@
               <w:pStyle w:val="Compact"/>
             </w:pPr>
             <w:r>
+              <w:t xml:space="preserve">항목</w:t>
+            </w:r>
+          </w:p>
+        </w:tc>
+        <w:tc>
+          <w:tcPr/>
+          <w:p>
+            <w:pPr>
+              <w:pStyle w:val="Compact"/>
+            </w:pPr>
+            <w:r>
+              <w:t xml:space="preserve">값</w:t>
+            </w:r>
+          </w:p>
+        </w:tc>
+      </w:tr>
+      <w:tr>
+        <w:tc>
+          <w:tcPr/>
+          <w:p>
+            <w:pPr>
+              <w:pStyle w:val="Compact"/>
+            </w:pPr>
+            <w:r>
+              <w:t xml:space="preserve">실행일</w:t>
+            </w:r>
+          </w:p>
+        </w:tc>
+        <w:tc>
+          <w:tcPr/>
+          <w:p>
+            <w:pPr>
+              <w:pStyle w:val="Compact"/>
+            </w:pPr>
+            <w:r>
+              <w:t xml:space="preserve">2026-04-23</w:t>
+            </w:r>
+          </w:p>
+        </w:tc>
+      </w:tr>
+      <w:tr>
+        <w:tc>
+          <w:tcPr/>
+          <w:p>
+            <w:pPr>
+              <w:pStyle w:val="Compact"/>
+            </w:pPr>
+            <w:r>
+              <w:t xml:space="preserve">백업 ID</w:t>
+            </w:r>
+          </w:p>
+        </w:tc>
+        <w:tc>
+          <w:tcPr/>
+          <w:p>
+            <w:pPr>
+              <w:pStyle w:val="Compact"/>
+            </w:pPr>
+            <w:r>
+              <w:rPr>
+                <w:rStyle w:val="VerbatimChar"/>
+              </w:rPr>
+              <w:t xml:space="preserve">20260423T050431</w:t>
+            </w:r>
+          </w:p>
+        </w:tc>
+      </w:tr>
+      <w:tr>
+        <w:tc>
+          <w:tcPr/>
+          <w:p>
+            <w:pPr>
+              <w:pStyle w:val="Compact"/>
+            </w:pPr>
+            <w:r>
+              <w:t xml:space="preserve">복구 소요 시간</w:t>
+            </w:r>
+          </w:p>
+        </w:tc>
+        <w:tc>
+          <w:tcPr/>
+          <w:p>
+            <w:pPr>
+              <w:pStyle w:val="Compact"/>
+            </w:pPr>
+            <w:r>
+              <w:t xml:space="preserve">약 3분 20초</w:t>
+            </w:r>
+          </w:p>
+        </w:tc>
+      </w:tr>
+      <w:tr>
+        <w:tc>
+          <w:tcPr/>
+          <w:p>
+            <w:pPr>
+              <w:pStyle w:val="Compact"/>
+            </w:pPr>
+            <w:r>
+              <w:t xml:space="preserve">결과</w:t>
+            </w:r>
+          </w:p>
+        </w:tc>
+        <w:tc>
+          <w:tcPr/>
+          <w:p>
+            <w:pPr>
+              <w:pStyle w:val="Compact"/>
+            </w:pPr>
+            <w:r>
+              <w:rPr>
+                <w:b/>
+                <w:bCs/>
+              </w:rPr>
+              <w:t xml:space="preserve">PASS</w:t>
+            </w:r>
+          </w:p>
+        </w:tc>
+      </w:tr>
+    </w:tbl>
+    <w:bookmarkStart w:id="17" w:name="검증-항목"/>
+    <w:p>
+      <w:pPr>
+        <w:pStyle w:val="Heading3"/>
+      </w:pPr>
+      <w:r>
+        <w:t xml:space="preserve">검증 항목</w:t>
+      </w:r>
+    </w:p>
+    <w:tbl>
+      <w:tblPr>
+        <w:tblStyle w:val="Table"/>
+        <w:tblW w:type="auto" w:w="0"/>
+        <w:tblLook w:firstRow="1" w:lastRow="0" w:firstColumn="0" w:lastColumn="0" w:noHBand="0" w:noVBand="0" w:val="0020"/>
+      </w:tblPr>
+      <w:tblGrid>
+        <w:gridCol w:w="3960"/>
+        <w:gridCol w:w="3960"/>
+      </w:tblGrid>
+      <w:tr>
+        <w:trPr>
+          <w:tblHeader w:val="on"/>
+        </w:trPr>
+        <w:tc>
+          <w:tcPr/>
+          <w:p>
+            <w:pPr>
+              <w:pStyle w:val="Compact"/>
+            </w:pPr>
+            <w:r>
+              <w:t xml:space="preserve">기준</w:t>
+            </w:r>
+          </w:p>
+        </w:tc>
+        <w:tc>
+          <w:tcPr/>
+          <w:p>
+            <w:pPr>
+              <w:pStyle w:val="Compact"/>
+            </w:pPr>
+            <w:r>
+              <w:t xml:space="preserve">결과</w:t>
+            </w:r>
+          </w:p>
+        </w:tc>
+      </w:tr>
+      <w:tr>
+        <w:tc>
+          <w:tcPr/>
+          <w:p>
+            <w:pPr>
+              <w:pStyle w:val="Compact"/>
+            </w:pPr>
+            <w:r>
+              <w:t xml:space="preserve">pg-restore-test Ready within 5 min</w:t>
+            </w:r>
+          </w:p>
+        </w:tc>
+        <w:tc>
+          <w:tcPr/>
+          <w:p>
+            <w:pPr>
+              <w:pStyle w:val="Compact"/>
+            </w:pPr>
+            <w:r>
+              <w:t xml:space="preserve">PASS (3분 20초)</w:t>
+            </w:r>
+          </w:p>
+        </w:tc>
+      </w:tr>
+      <w:tr>
+        <w:tc>
+          <w:tcPr/>
+          <w:p>
+            <w:pPr>
+              <w:pStyle w:val="Compact"/>
+            </w:pPr>
+            <w:r>
+              <w:rPr>
+                <w:rStyle w:val="VerbatimChar"/>
+              </w:rPr>
+              <w:t xml:space="preserve">\l</w:t>
+            </w:r>
+            <w:r>
+              <w:t xml:space="preserve"> </w:t>
+            </w:r>
+            <w:r>
+              <w:t xml:space="preserve">에 dmz 데이터베이스 존재</w:t>
+            </w:r>
+          </w:p>
+        </w:tc>
+        <w:tc>
+          <w:tcPr/>
+          <w:p>
+            <w:pPr>
+              <w:pStyle w:val="Compact"/>
+            </w:pPr>
+            <w:r>
+              <w:t xml:space="preserve">PASS</w:t>
+            </w:r>
+          </w:p>
+        </w:tc>
+      </w:tr>
+      <w:tr>
+        <w:tc>
+          <w:tcPr/>
+          <w:p>
+            <w:pPr>
+              <w:pStyle w:val="Compact"/>
+            </w:pPr>
+            <w:r>
+              <w:rPr>
+                <w:rStyle w:val="VerbatimChar"/>
+              </w:rPr>
+              <w:t xml:space="preserve">\dt</w:t>
+            </w:r>
+            <w:r>
+              <w:t xml:space="preserve"> </w:t>
+            </w:r>
+            <w:r>
+              <w:t xml:space="preserve">에 document, ocr_result 테이블 존재</w:t>
+            </w:r>
+          </w:p>
+        </w:tc>
+        <w:tc>
+          <w:tcPr/>
+          <w:p>
+            <w:pPr>
+              <w:pStyle w:val="Compact"/>
+            </w:pPr>
+            <w:r>
+              <w:t xml:space="preserve">PASS</w:t>
+            </w:r>
+          </w:p>
+        </w:tc>
+      </w:tr>
+      <w:tr>
+        <w:tc>
+          <w:tcPr/>
+          <w:p>
+            <w:pPr>
+              <w:pStyle w:val="Compact"/>
+            </w:pPr>
+            <w:r>
+              <w:t xml:space="preserve">document count &gt; 0</w:t>
+            </w:r>
+          </w:p>
+        </w:tc>
+        <w:tc>
+          <w:tcPr/>
+          <w:p>
+            <w:pPr>
+              <w:pStyle w:val="Compact"/>
+            </w:pPr>
+            <w:r>
+              <w:t xml:space="preserve">PASS (45행)</w:t>
+            </w:r>
+          </w:p>
+        </w:tc>
+      </w:tr>
+      <w:tr>
+        <w:tc>
+          <w:tcPr/>
+          <w:p>
+            <w:pPr>
+              <w:pStyle w:val="Compact"/>
+            </w:pPr>
+            <w:r>
+              <w:t xml:space="preserve">ocr_result count &gt; 0</w:t>
+            </w:r>
+          </w:p>
+        </w:tc>
+        <w:tc>
+          <w:tcPr/>
+          <w:p>
+            <w:pPr>
+              <w:pStyle w:val="Compact"/>
+            </w:pPr>
+            <w:r>
+              <w:t xml:space="preserve">PASS (40행)</w:t>
+            </w:r>
+          </w:p>
+        </w:tc>
+      </w:tr>
+      <w:tr>
+        <w:tc>
+          <w:tcPr/>
+          <w:p>
+            <w:pPr>
+              <w:pStyle w:val="Compact"/>
+            </w:pPr>
+            <w:r>
+              <w:t xml:space="preserve">클린업 완료</w:t>
+            </w:r>
+          </w:p>
+        </w:tc>
+        <w:tc>
+          <w:tcPr/>
+          <w:p>
+            <w:pPr>
+              <w:pStyle w:val="Compact"/>
+            </w:pPr>
+            <w:r>
+              <w:t xml:space="preserve">PASS</w:t>
+            </w:r>
+          </w:p>
+        </w:tc>
+      </w:tr>
+    </w:tbl>
+    <w:p>
+      <w:pPr>
+        <w:pStyle w:val="BlockText"/>
+      </w:pPr>
+      <w:r>
+        <w:t xml:space="preserve">상세 결과:</w:t>
+      </w:r>
+      <w:r>
+        <w:t xml:space="preserve"> </w:t>
+      </w:r>
+      <w:r>
+        <w:rPr>
+          <w:rStyle w:val="VerbatimChar"/>
+        </w:rPr>
+        <w:t xml:space="preserve">tests/smoke/pitr_dry_run.md</w:t>
+      </w:r>
+      <w:r>
+        <w:t xml:space="preserve"> </w:t>
+      </w:r>
+      <w:r>
+        <w:t xml:space="preserve">참조</w:t>
+      </w:r>
+    </w:p>
+    <w:bookmarkEnd w:id="17"/>
+    <w:bookmarkStart w:id="18" w:name="핵심-발견사항-servername-필드-필수"/>
+    <w:p>
+      <w:pPr>
+        <w:pStyle w:val="Heading3"/>
+      </w:pPr>
+      <w:r>
+        <w:t xml:space="preserve">핵심 발견사항: serverName 필드 필수</w:t>
+      </w:r>
+    </w:p>
+    <w:p>
+      <w:pPr>
+        <w:pStyle w:val="FirstParagraph"/>
+      </w:pPr>
+      <w:r>
+        <w:t xml:space="preserve">CNPG externalClusters 에서</w:t>
+      </w:r>
+      <w:r>
+        <w:t xml:space="preserve"> </w:t>
+      </w:r>
+      <w:r>
+        <w:rPr>
+          <w:rStyle w:val="VerbatimChar"/>
+        </w:rPr>
+        <w:t xml:space="preserve">serverName</w:t>
+      </w:r>
+      <w:r>
+        <w:t xml:space="preserve">을 명시하지 않으면</w:t>
+      </w:r>
+      <w:r>
+        <w:t xml:space="preserve"> </w:t>
+      </w:r>
+      <w:r>
+        <w:rPr>
+          <w:rStyle w:val="VerbatimChar"/>
+        </w:rPr>
+        <w:t xml:space="preserve">no target backup found</w:t>
+      </w:r>
+      <w:r>
+        <w:t xml:space="preserve"> </w:t>
+      </w:r>
+      <w:r>
+        <w:t xml:space="preserve">에러 발생.</w:t>
+      </w:r>
+      <w:r>
+        <w:br/>
+      </w:r>
+      <w:r>
+        <w:t xml:space="preserve">원본 클러스터명(</w:t>
+      </w:r>
+      <w:r>
+        <w:rPr>
+          <w:rStyle w:val="VerbatimChar"/>
+        </w:rPr>
+        <w:t xml:space="preserve">pg-main</w:t>
+      </w:r>
+      <w:r>
+        <w:t xml:space="preserve">)을</w:t>
+      </w:r>
+      <w:r>
+        <w:t xml:space="preserve"> </w:t>
+      </w:r>
+      <w:r>
+        <w:rPr>
+          <w:rStyle w:val="VerbatimChar"/>
+        </w:rPr>
+        <w:t xml:space="preserve">serverName</w:t>
+      </w:r>
+      <w:r>
+        <w:t xml:space="preserve">에 명시해야 barman이 올바른 S3 경로를 탐색:</w:t>
+      </w:r>
+    </w:p>
+    <w:p>
+      <w:pPr>
+        <w:pStyle w:val="SourceCode"/>
+      </w:pPr>
+      <w:r>
+        <w:rPr>
+          <w:rStyle w:val="VerbatimChar"/>
+        </w:rPr>
+        <w:t xml:space="preserve">s3://pg-backups/pg-main/pg-main/base/&lt;backupId&gt;/</w:t>
+      </w:r>
+      <w:r>
+        <w:br/>
+      </w:r>
+      <w:r>
+        <w:rPr>
+          <w:rStyle w:val="VerbatimChar"/>
+        </w:rPr>
+        <w:t xml:space="preserve">                        ^^^^^^^^ serverName</w:t>
+      </w:r>
+    </w:p>
+    <w:p>
+      <w:r>
+        <w:pict>
+          <v:rect style="width:0;height:1.5pt" o:hralign="center" o:hrstd="t" o:hr="t"/>
+        </w:pict>
+      </w:r>
+    </w:p>
+    <w:bookmarkEnd w:id="18"/>
+    <w:bookmarkEnd w:id="19"/>
+    <w:bookmarkStart w:id="24" w:name="Xa4a05f9e90bb509b189007cdf45266088f84167"/>
+    <w:p>
+      <w:pPr>
+        <w:pStyle w:val="Heading2"/>
+      </w:pPr>
+      <w:r>
+        <w:t xml:space="preserve">6. 복구 절차 (Point-in-Time Recovery)</w:t>
+      </w:r>
+    </w:p>
+    <w:bookmarkStart w:id="20" w:name="Xf5e586c5bbb78a99fac699224799a62744dd827"/>
+    <w:p>
+      <w:pPr>
+        <w:pStyle w:val="Heading3"/>
+      </w:pPr>
+      <w:r>
+        <w:t xml:space="preserve">5.1 사전 준비</w:t>
+      </w:r>
+    </w:p>
+    <w:p>
+      <w:pPr>
+        <w:pStyle w:val="Compact"/>
+        <w:numPr>
+          <w:ilvl w:val="0"/>
+          <w:numId w:val="1002"/>
+        </w:numPr>
+      </w:pPr>
+      <w:r>
+        <w:t xml:space="preserve">복구할 시점(target time) 결정 — RFC3339 형식:</w:t>
+      </w:r>
+      <w:r>
+        <w:t xml:space="preserve"> </w:t>
+      </w:r>
+      <w:r>
+        <w:rPr>
+          <w:rStyle w:val="VerbatimChar"/>
+        </w:rPr>
+        <w:t xml:space="preserve">2026-04-22T03:00:00+09:00</w:t>
+      </w:r>
+    </w:p>
+    <w:p>
+      <w:pPr>
+        <w:pStyle w:val="Compact"/>
+        <w:numPr>
+          <w:ilvl w:val="0"/>
+          <w:numId w:val="1002"/>
+        </w:numPr>
+      </w:pPr>
+      <w:r>
+        <w:t xml:space="preserve">복구 대상 네임스페이스 및 Cluster 이름 결정 (기존과 다른 이름 권장)</w:t>
+      </w:r>
+    </w:p>
+    <w:p>
+      <w:pPr>
+        <w:pStyle w:val="Compact"/>
+        <w:numPr>
+          <w:ilvl w:val="0"/>
+          <w:numId w:val="1002"/>
+        </w:numPr>
+      </w:pPr>
+      <w:r>
+        <w:t xml:space="preserve">S3에서 해당 시점 이전의 백업 ID 확인:</w:t>
+      </w:r>
+    </w:p>
+    <w:p>
+      <w:pPr>
+        <w:pStyle w:val="SourceCode"/>
+      </w:pPr>
+      <w:r>
+        <w:rPr>
+          <w:rStyle w:val="ExtensionTok"/>
+        </w:rPr>
+        <w:t xml:space="preserve">kubectl</w:t>
+      </w:r>
+      <w:r>
+        <w:rPr>
+          <w:rStyle w:val="NormalTok"/>
+        </w:rPr>
+        <w:t xml:space="preserve"> </w:t>
+      </w:r>
+      <w:r>
+        <w:rPr>
+          <w:rStyle w:val="AttributeTok"/>
+        </w:rPr>
+        <w:t xml:space="preserve">-n</w:t>
+      </w:r>
+      <w:r>
+        <w:rPr>
+          <w:rStyle w:val="NormalTok"/>
+        </w:rPr>
+        <w:t xml:space="preserve"> processing run s3ls </w:t>
+      </w:r>
+      <w:r>
+        <w:rPr>
+          <w:rStyle w:val="AttributeTok"/>
+        </w:rPr>
+        <w:t xml:space="preserve">--rm</w:t>
+      </w:r>
+      <w:r>
+        <w:rPr>
+          <w:rStyle w:val="NormalTok"/>
+        </w:rPr>
+        <w:t xml:space="preserve"> </w:t>
+      </w:r>
+      <w:r>
+        <w:rPr>
+          <w:rStyle w:val="AttributeTok"/>
+        </w:rPr>
+        <w:t xml:space="preserve">-i</w:t>
+      </w:r>
+      <w:r>
+        <w:rPr>
+          <w:rStyle w:val="NormalTok"/>
+        </w:rPr>
+        <w:t xml:space="preserve"> </w:t>
+      </w:r>
+      <w:r>
+        <w:rPr>
+          <w:rStyle w:val="AttributeTok"/>
+        </w:rPr>
+        <w:t xml:space="preserve">--restart</w:t>
+      </w:r>
+      <w:r>
+        <w:rPr>
+          <w:rStyle w:val="OperatorTok"/>
+        </w:rPr>
+        <w:t xml:space="preserve">=</w:t>
+      </w:r>
+      <w:r>
+        <w:rPr>
+          <w:rStyle w:val="NormalTok"/>
+        </w:rPr>
+        <w:t xml:space="preserve">Never </w:t>
+      </w:r>
+      <w:r>
+        <w:rPr>
+          <w:rStyle w:val="AttributeTok"/>
+        </w:rPr>
+        <w:t xml:space="preserve">--image</w:t>
+      </w:r>
+      <w:r>
+        <w:rPr>
+          <w:rStyle w:val="OperatorTok"/>
+        </w:rPr>
+        <w:t xml:space="preserve">=</w:t>
+      </w:r>
+      <w:r>
+        <w:rPr>
+          <w:rStyle w:val="NormalTok"/>
+        </w:rPr>
+        <w:t xml:space="preserve">amazon/aws-cli:2.15.30 </w:t>
+      </w:r>
+      <w:r>
+        <w:rPr>
+          <w:rStyle w:val="DataTypeTok"/>
+        </w:rPr>
+        <w:t xml:space="preserve">\</w:t>
+      </w:r>
+      <w:r>
+        <w:br/>
+      </w:r>
+      <w:r>
+        <w:rPr>
+          <w:rStyle w:val="NormalTok"/>
+        </w:rPr>
+        <w:t xml:space="preserve">  </w:t>
+      </w:r>
+      <w:r>
+        <w:rPr>
+          <w:rStyle w:val="AttributeTok"/>
+        </w:rPr>
+        <w:t xml:space="preserve">--env</w:t>
+      </w:r>
+      <w:r>
+        <w:rPr>
+          <w:rStyle w:val="OperatorTok"/>
+        </w:rPr>
+        <w:t xml:space="preserve">=</w:t>
+      </w:r>
+      <w:r>
+        <w:rPr>
+          <w:rStyle w:val="StringTok"/>
+        </w:rPr>
+        <w:t xml:space="preserve">"AWS_ACCESS_KEY_ID=dev-backup-access-key"</w:t>
+      </w:r>
+      <w:r>
+        <w:rPr>
+          <w:rStyle w:val="NormalTok"/>
+        </w:rPr>
+        <w:t xml:space="preserve"> </w:t>
+      </w:r>
+      <w:r>
+        <w:rPr>
+          <w:rStyle w:val="DataTypeTok"/>
+        </w:rPr>
+        <w:t xml:space="preserve">\</w:t>
+      </w:r>
+      <w:r>
+        <w:br/>
+      </w:r>
+      <w:r>
+        <w:rPr>
+          <w:rStyle w:val="NormalTok"/>
+        </w:rPr>
+        <w:t xml:space="preserve">  </w:t>
+      </w:r>
+      <w:r>
+        <w:rPr>
+          <w:rStyle w:val="AttributeTok"/>
+        </w:rPr>
+        <w:t xml:space="preserve">--env</w:t>
+      </w:r>
+      <w:r>
+        <w:rPr>
+          <w:rStyle w:val="OperatorTok"/>
+        </w:rPr>
+        <w:t xml:space="preserve">=</w:t>
+      </w:r>
+      <w:r>
+        <w:rPr>
+          <w:rStyle w:val="StringTok"/>
+        </w:rPr>
+        <w:t xml:space="preserve">"AWS_SECRET_ACCESS_KEY=dev-backup-secret-key"</w:t>
+      </w:r>
+      <w:r>
+        <w:rPr>
+          <w:rStyle w:val="NormalTok"/>
+        </w:rPr>
+        <w:t xml:space="preserve"> </w:t>
+      </w:r>
+      <w:r>
+        <w:rPr>
+          <w:rStyle w:val="DataTypeTok"/>
+        </w:rPr>
+        <w:t xml:space="preserve">\</w:t>
+      </w:r>
+      <w:r>
+        <w:br/>
+      </w:r>
+      <w:r>
+        <w:rPr>
+          <w:rStyle w:val="NormalTok"/>
+        </w:rPr>
+        <w:t xml:space="preserve">  </w:t>
+      </w:r>
+      <w:r>
+        <w:rPr>
+          <w:rStyle w:val="AttributeTok"/>
+        </w:rPr>
+        <w:t xml:space="preserve">--env</w:t>
+      </w:r>
+      <w:r>
+        <w:rPr>
+          <w:rStyle w:val="OperatorTok"/>
+        </w:rPr>
+        <w:t xml:space="preserve">=</w:t>
+      </w:r>
+      <w:r>
+        <w:rPr>
+          <w:rStyle w:val="StringTok"/>
+        </w:rPr>
+        <w:t xml:space="preserve">"AWS_DEFAULT_REGION=us-east-1"</w:t>
+      </w:r>
+      <w:r>
+        <w:rPr>
+          <w:rStyle w:val="NormalTok"/>
+        </w:rPr>
+        <w:t xml:space="preserve"> </w:t>
+      </w:r>
+      <w:r>
+        <w:rPr>
+          <w:rStyle w:val="DataTypeTok"/>
+        </w:rPr>
+        <w:t xml:space="preserve">\</w:t>
+      </w:r>
+      <w:r>
+        <w:br/>
+      </w:r>
+      <w:r>
+        <w:rPr>
+          <w:rStyle w:val="NormalTok"/>
+        </w:rPr>
+        <w:t xml:space="preserve">  </w:t>
+      </w:r>
+      <w:r>
+        <w:rPr>
+          <w:rStyle w:val="AttributeTok"/>
+        </w:rPr>
+        <w:t xml:space="preserve">--command</w:t>
+      </w:r>
+      <w:r>
+        <w:rPr>
+          <w:rStyle w:val="NormalTok"/>
+        </w:rPr>
+        <w:t xml:space="preserve"> </w:t>
+      </w:r>
+      <w:r>
+        <w:rPr>
+          <w:rStyle w:val="AttributeTok"/>
+        </w:rPr>
+        <w:t xml:space="preserve">--</w:t>
+      </w:r>
+      <w:r>
+        <w:rPr>
+          <w:rStyle w:val="NormalTok"/>
+        </w:rPr>
+        <w:t xml:space="preserve"> aws </w:t>
+      </w:r>
+      <w:r>
+        <w:rPr>
+          <w:rStyle w:val="DataTypeTok"/>
+        </w:rPr>
+        <w:t xml:space="preserve">\</w:t>
+      </w:r>
+      <w:r>
+        <w:br/>
+      </w:r>
+      <w:r>
+        <w:rPr>
+          <w:rStyle w:val="NormalTok"/>
+        </w:rPr>
+        <w:t xml:space="preserve">  </w:t>
+      </w:r>
+      <w:r>
+        <w:rPr>
+          <w:rStyle w:val="AttributeTok"/>
+        </w:rPr>
+        <w:t xml:space="preserve">--endpoint-url</w:t>
+      </w:r>
+      <w:r>
+        <w:rPr>
+          <w:rStyle w:val="NormalTok"/>
+        </w:rPr>
+        <w:t xml:space="preserve"> </w:t>
+      </w:r>
+      <w:r>
+        <w:rPr>
+          <w:rStyle w:val="StringTok"/>
+        </w:rPr>
+        <w:t xml:space="preserve">"http://seaweedfs-s3.processing.svc.cluster.local:8333"</w:t>
+      </w:r>
+      <w:r>
+        <w:rPr>
+          <w:rStyle w:val="NormalTok"/>
+        </w:rPr>
+        <w:t xml:space="preserve"> </w:t>
+      </w:r>
+      <w:r>
+        <w:rPr>
+          <w:rStyle w:val="DataTypeTok"/>
+        </w:rPr>
+        <w:t xml:space="preserve">\</w:t>
+      </w:r>
+      <w:r>
+        <w:br/>
+      </w:r>
+      <w:r>
+        <w:rPr>
+          <w:rStyle w:val="NormalTok"/>
+        </w:rPr>
+        <w:t xml:space="preserve">  s3 ls s3://pg-backups/pg-main/pg-main/base/</w:t>
+      </w:r>
+    </w:p>
+    <w:bookmarkEnd w:id="20"/>
+    <w:bookmarkStart w:id="21" w:name="X6f644232a2675851c21917be0318db93dfa4771"/>
+    <w:p>
+      <w:pPr>
+        <w:pStyle w:val="Heading3"/>
+      </w:pPr>
+      <w:r>
+        <w:t xml:space="preserve">5.2 PITR Cluster 매니페스트</w:t>
+      </w:r>
+    </w:p>
+    <w:p>
+      <w:pPr>
+        <w:pStyle w:val="SourceCode"/>
+      </w:pPr>
+      <w:r>
+        <w:rPr>
+          <w:rStyle w:val="FunctionTok"/>
+        </w:rPr>
+        <w:t xml:space="preserve">apiVersion</w:t>
+      </w:r>
+      <w:r>
+        <w:rPr>
+          <w:rStyle w:val="KeywordTok"/>
+        </w:rPr>
+        <w:t xml:space="preserve">:</w:t>
+      </w:r>
+      <w:r>
+        <w:rPr>
+          <w:rStyle w:val="AttributeTok"/>
+        </w:rPr>
+        <w:t xml:space="preserve"> postgresql.cnpg.io/v1</w:t>
+      </w:r>
+      <w:r>
+        <w:br/>
+      </w:r>
+      <w:r>
+        <w:rPr>
+          <w:rStyle w:val="FunctionTok"/>
+        </w:rPr>
+        <w:t xml:space="preserve">kind</w:t>
+      </w:r>
+      <w:r>
+        <w:rPr>
+          <w:rStyle w:val="KeywordTok"/>
+        </w:rPr>
+        <w:t xml:space="preserve">:</w:t>
+      </w:r>
+      <w:r>
+        <w:rPr>
+          <w:rStyle w:val="AttributeTok"/>
+        </w:rPr>
+        <w:t xml:space="preserve"> Cluster</w:t>
+      </w:r>
+      <w:r>
+        <w:br/>
+      </w:r>
+      <w:r>
+        <w:rPr>
+          <w:rStyle w:val="FunctionTok"/>
+        </w:rPr>
+        <w:t xml:space="preserve">metadata</w:t>
+      </w:r>
+      <w:r>
+        <w:rPr>
+          <w:rStyle w:val="KeywordTok"/>
+        </w:rPr>
+        <w:t xml:space="preserve">:</w:t>
+      </w:r>
+      <w:r>
+        <w:br/>
+      </w:r>
+      <w:r>
+        <w:rPr>
+          <w:rStyle w:val="AttributeTok"/>
+        </w:rPr>
+        <w:t xml:space="preserve">  </w:t>
+      </w:r>
+      <w:r>
+        <w:rPr>
+          <w:rStyle w:val="FunctionTok"/>
+        </w:rPr>
+        <w:t xml:space="preserve">name</w:t>
+      </w:r>
+      <w:r>
+        <w:rPr>
+          <w:rStyle w:val="KeywordTok"/>
+        </w:rPr>
+        <w:t xml:space="preserve">:</w:t>
+      </w:r>
+      <w:r>
+        <w:rPr>
+          <w:rStyle w:val="AttributeTok"/>
+        </w:rPr>
+        <w:t xml:space="preserve"> pg-main-restore</w:t>
+      </w:r>
+      <w:r>
+        <w:br/>
+      </w:r>
+      <w:r>
+        <w:rPr>
+          <w:rStyle w:val="AttributeTok"/>
+        </w:rPr>
+        <w:t xml:space="preserve">  </w:t>
+      </w:r>
+      <w:r>
+        <w:rPr>
+          <w:rStyle w:val="FunctionTok"/>
+        </w:rPr>
+        <w:t xml:space="preserve">namespace</w:t>
+      </w:r>
+      <w:r>
+        <w:rPr>
+          <w:rStyle w:val="KeywordTok"/>
+        </w:rPr>
+        <w:t xml:space="preserve">:</w:t>
+      </w:r>
+      <w:r>
+        <w:rPr>
+          <w:rStyle w:val="AttributeTok"/>
+        </w:rPr>
+        <w:t xml:space="preserve"> processing</w:t>
+      </w:r>
+      <w:r>
+        <w:br/>
+      </w:r>
+      <w:r>
+        <w:rPr>
+          <w:rStyle w:val="FunctionTok"/>
+        </w:rPr>
+        <w:t xml:space="preserve">spec</w:t>
+      </w:r>
+      <w:r>
+        <w:rPr>
+          <w:rStyle w:val="KeywordTok"/>
+        </w:rPr>
+        <w:t xml:space="preserve">:</w:t>
+      </w:r>
+      <w:r>
+        <w:br/>
+      </w:r>
+      <w:r>
+        <w:rPr>
+          <w:rStyle w:val="AttributeTok"/>
+        </w:rPr>
+        <w:t xml:space="preserve">  </w:t>
+      </w:r>
+      <w:r>
+        <w:rPr>
+          <w:rStyle w:val="FunctionTok"/>
+        </w:rPr>
+        <w:t xml:space="preserve">instances</w:t>
+      </w:r>
+      <w:r>
+        <w:rPr>
+          <w:rStyle w:val="KeywordTok"/>
+        </w:rPr>
+        <w:t xml:space="preserve">:</w:t>
+      </w:r>
+      <w:r>
+        <w:rPr>
+          <w:rStyle w:val="AttributeTok"/>
+        </w:rPr>
+        <w:t xml:space="preserve"> </w:t>
+      </w:r>
+      <w:r>
+        <w:rPr>
+          <w:rStyle w:val="DecValTok"/>
+        </w:rPr>
+        <w:t xml:space="preserve">1</w:t>
+      </w:r>
+      <w:r>
+        <w:br/>
+      </w:r>
+      <w:r>
+        <w:rPr>
+          <w:rStyle w:val="AttributeTok"/>
+        </w:rPr>
+        <w:t xml:space="preserve">  </w:t>
+      </w:r>
+      <w:r>
+        <w:rPr>
+          <w:rStyle w:val="FunctionTok"/>
+        </w:rPr>
+        <w:t xml:space="preserve">imageName</w:t>
+      </w:r>
+      <w:r>
+        <w:rPr>
+          <w:rStyle w:val="KeywordTok"/>
+        </w:rPr>
+        <w:t xml:space="preserve">:</w:t>
+      </w:r>
+      <w:r>
+        <w:rPr>
+          <w:rStyle w:val="AttributeTok"/>
+        </w:rPr>
+        <w:t xml:space="preserve"> ghcr.io/cloudnative-pg/postgresql:16.2</w:t>
+      </w:r>
+      <w:r>
+        <w:br/>
+      </w:r>
+      <w:r>
+        <w:rPr>
+          <w:rStyle w:val="AttributeTok"/>
+        </w:rPr>
+        <w:t xml:space="preserve">  </w:t>
+      </w:r>
+      <w:r>
+        <w:rPr>
+          <w:rStyle w:val="FunctionTok"/>
+        </w:rPr>
+        <w:t xml:space="preserve">storage</w:t>
+      </w:r>
+      <w:r>
+        <w:rPr>
+          <w:rStyle w:val="KeywordTok"/>
+        </w:rPr>
+        <w:t xml:space="preserve">:</w:t>
+      </w:r>
+      <w:r>
+        <w:br/>
+      </w:r>
+      <w:r>
+        <w:rPr>
+          <w:rStyle w:val="AttributeTok"/>
+        </w:rPr>
+        <w:t xml:space="preserve">    </w:t>
+      </w:r>
+      <w:r>
+        <w:rPr>
+          <w:rStyle w:val="FunctionTok"/>
+        </w:rPr>
+        <w:t xml:space="preserve">size</w:t>
+      </w:r>
+      <w:r>
+        <w:rPr>
+          <w:rStyle w:val="KeywordTok"/>
+        </w:rPr>
+        <w:t xml:space="preserve">:</w:t>
+      </w:r>
+      <w:r>
+        <w:rPr>
+          <w:rStyle w:val="AttributeTok"/>
+        </w:rPr>
+        <w:t xml:space="preserve"> 10Gi</w:t>
+      </w:r>
+      <w:r>
+        <w:br/>
+      </w:r>
+      <w:r>
+        <w:rPr>
+          <w:rStyle w:val="AttributeTok"/>
+        </w:rPr>
+        <w:t xml:space="preserve">    </w:t>
+      </w:r>
+      <w:r>
+        <w:rPr>
+          <w:rStyle w:val="FunctionTok"/>
+        </w:rPr>
+        <w:t xml:space="preserve">storageClass</w:t>
+      </w:r>
+      <w:r>
+        <w:rPr>
+          <w:rStyle w:val="KeywordTok"/>
+        </w:rPr>
+        <w:t xml:space="preserve">:</w:t>
+      </w:r>
+      <w:r>
+        <w:rPr>
+          <w:rStyle w:val="AttributeTok"/>
+        </w:rPr>
+        <w:t xml:space="preserve"> standard</w:t>
+      </w:r>
+      <w:r>
+        <w:br/>
+      </w:r>
+      <w:r>
+        <w:rPr>
+          <w:rStyle w:val="AttributeTok"/>
+        </w:rPr>
+        <w:t xml:space="preserve">  </w:t>
+      </w:r>
+      <w:r>
+        <w:rPr>
+          <w:rStyle w:val="FunctionTok"/>
+        </w:rPr>
+        <w:t xml:space="preserve">bootstrap</w:t>
+      </w:r>
+      <w:r>
+        <w:rPr>
+          <w:rStyle w:val="KeywordTok"/>
+        </w:rPr>
+        <w:t xml:space="preserve">:</w:t>
+      </w:r>
+      <w:r>
+        <w:br/>
+      </w:r>
+      <w:r>
+        <w:rPr>
+          <w:rStyle w:val="AttributeTok"/>
+        </w:rPr>
+        <w:t xml:space="preserve">    </w:t>
+      </w:r>
+      <w:r>
+        <w:rPr>
+          <w:rStyle w:val="FunctionTok"/>
+        </w:rPr>
+        <w:t xml:space="preserve">recovery</w:t>
+      </w:r>
+      <w:r>
+        <w:rPr>
+          <w:rStyle w:val="KeywordTok"/>
+        </w:rPr>
+        <w:t xml:space="preserve">:</w:t>
+      </w:r>
+      <w:r>
+        <w:br/>
+      </w:r>
+      <w:r>
+        <w:rPr>
+          <w:rStyle w:val="AttributeTok"/>
+        </w:rPr>
+        <w:t xml:space="preserve">      </w:t>
+      </w:r>
+      <w:r>
+        <w:rPr>
+          <w:rStyle w:val="FunctionTok"/>
+        </w:rPr>
+        <w:t xml:space="preserve">source</w:t>
+      </w:r>
+      <w:r>
+        <w:rPr>
+          <w:rStyle w:val="KeywordTok"/>
+        </w:rPr>
+        <w:t xml:space="preserve">:</w:t>
+      </w:r>
+      <w:r>
+        <w:rPr>
+          <w:rStyle w:val="AttributeTok"/>
+        </w:rPr>
+        <w:t xml:space="preserve"> pg-main-backup</w:t>
+      </w:r>
+      <w:r>
+        <w:br/>
+      </w:r>
+      <w:r>
+        <w:rPr>
+          <w:rStyle w:val="AttributeTok"/>
+        </w:rPr>
+        <w:t xml:space="preserve">      </w:t>
+      </w:r>
+      <w:r>
+        <w:rPr>
+          <w:rStyle w:val="FunctionTok"/>
+        </w:rPr>
+        <w:t xml:space="preserve">recoveryTarget</w:t>
+      </w:r>
+      <w:r>
+        <w:rPr>
+          <w:rStyle w:val="KeywordTok"/>
+        </w:rPr>
+        <w:t xml:space="preserve">:</w:t>
+      </w:r>
+      <w:r>
+        <w:br/>
+      </w:r>
+      <w:r>
+        <w:rPr>
+          <w:rStyle w:val="CommentTok"/>
+        </w:rPr>
+        <w:t xml:space="preserve">        # 특정 시점 복구 (KST → UTC 변환 필요)</w:t>
+      </w:r>
+      <w:r>
+        <w:br/>
+      </w:r>
+      <w:r>
+        <w:rPr>
+          <w:rStyle w:val="AttributeTok"/>
+        </w:rPr>
+        <w:t xml:space="preserve">        </w:t>
+      </w:r>
+      <w:r>
+        <w:rPr>
+          <w:rStyle w:val="FunctionTok"/>
+        </w:rPr>
+        <w:t xml:space="preserve">targetTime</w:t>
+      </w:r>
+      <w:r>
+        <w:rPr>
+          <w:rStyle w:val="KeywordTok"/>
+        </w:rPr>
+        <w:t xml:space="preserve">:</w:t>
+      </w:r>
+      <w:r>
+        <w:rPr>
+          <w:rStyle w:val="AttributeTok"/>
+        </w:rPr>
+        <w:t xml:space="preserve"> </w:t>
+      </w:r>
+      <w:r>
+        <w:rPr>
+          <w:rStyle w:val="StringTok"/>
+        </w:rPr>
+        <w:t xml:space="preserve">"2026-04-22T18:00:00Z"</w:t>
+      </w:r>
+      <w:r>
+        <w:br/>
+      </w:r>
+      <w:r>
+        <w:rPr>
+          <w:rStyle w:val="CommentTok"/>
+        </w:rPr>
+        <w:t xml:space="preserve">        # 또는 특정 WAL LSN:</w:t>
+      </w:r>
+      <w:r>
+        <w:br/>
+      </w:r>
+      <w:r>
+        <w:rPr>
+          <w:rStyle w:val="CommentTok"/>
+        </w:rPr>
+        <w:t xml:space="preserve">        # targetLSN: "0/41000000"</w:t>
+      </w:r>
+      <w:r>
+        <w:br/>
+      </w:r>
+      <w:r>
+        <w:rPr>
+          <w:rStyle w:val="CommentTok"/>
+        </w:rPr>
+        <w:t xml:space="preserve">        # 또는 특정 백업 ID:</w:t>
+      </w:r>
+      <w:r>
+        <w:br/>
+      </w:r>
+      <w:r>
+        <w:rPr>
+          <w:rStyle w:val="CommentTok"/>
+        </w:rPr>
+        <w:t xml:space="preserve">        # backupID: "20260422T030000"</w:t>
+      </w:r>
+      <w:r>
+        <w:br/>
+      </w:r>
+      <w:r>
+        <w:rPr>
+          <w:rStyle w:val="AttributeTok"/>
+        </w:rPr>
+        <w:t xml:space="preserve">  </w:t>
+      </w:r>
+      <w:r>
+        <w:rPr>
+          <w:rStyle w:val="FunctionTok"/>
+        </w:rPr>
+        <w:t xml:space="preserve">externalClusters</w:t>
+      </w:r>
+      <w:r>
+        <w:rPr>
+          <w:rStyle w:val="KeywordTok"/>
+        </w:rPr>
+        <w:t xml:space="preserve">:</w:t>
+      </w:r>
+      <w:r>
+        <w:br/>
+      </w:r>
+      <w:r>
+        <w:rPr>
+          <w:rStyle w:val="AttributeTok"/>
+        </w:rPr>
+        <w:t xml:space="preserve">    </w:t>
+      </w:r>
+      <w:r>
+        <w:rPr>
+          <w:rStyle w:val="KeywordTok"/>
+        </w:rPr>
+        <w:t xml:space="preserve">-</w:t>
+      </w:r>
+      <w:r>
+        <w:rPr>
+          <w:rStyle w:val="AttributeTok"/>
+        </w:rPr>
+        <w:t xml:space="preserve"> </w:t>
+      </w:r>
+      <w:r>
+        <w:rPr>
+          <w:rStyle w:val="FunctionTok"/>
+        </w:rPr>
+        <w:t xml:space="preserve">name</w:t>
+      </w:r>
+      <w:r>
+        <w:rPr>
+          <w:rStyle w:val="KeywordTok"/>
+        </w:rPr>
+        <w:t xml:space="preserve">:</w:t>
+      </w:r>
+      <w:r>
+        <w:rPr>
+          <w:rStyle w:val="AttributeTok"/>
+        </w:rPr>
+        <w:t xml:space="preserve"> pg-main-backup</w:t>
+      </w:r>
+      <w:r>
+        <w:br/>
+      </w:r>
+      <w:r>
+        <w:rPr>
+          <w:rStyle w:val="AttributeTok"/>
+        </w:rPr>
+        <w:t xml:space="preserve">      </w:t>
+      </w:r>
+      <w:r>
+        <w:rPr>
+          <w:rStyle w:val="FunctionTok"/>
+        </w:rPr>
+        <w:t xml:space="preserve">barmanObjectStore</w:t>
+      </w:r>
+      <w:r>
+        <w:rPr>
+          <w:rStyle w:val="KeywordTok"/>
+        </w:rPr>
+        <w:t xml:space="preserve">:</w:t>
+      </w:r>
+      <w:r>
+        <w:br/>
+      </w:r>
+      <w:r>
+        <w:rPr>
+          <w:rStyle w:val="AttributeTok"/>
+        </w:rPr>
+        <w:t xml:space="preserve">        </w:t>
+      </w:r>
+      <w:r>
+        <w:rPr>
+          <w:rStyle w:val="FunctionTok"/>
+        </w:rPr>
+        <w:t xml:space="preserve">destinationPath</w:t>
+      </w:r>
+      <w:r>
+        <w:rPr>
+          <w:rStyle w:val="KeywordTok"/>
+        </w:rPr>
+        <w:t xml:space="preserve">:</w:t>
+      </w:r>
+      <w:r>
+        <w:rPr>
+          <w:rStyle w:val="AttributeTok"/>
+        </w:rPr>
+        <w:t xml:space="preserve"> </w:t>
+      </w:r>
+      <w:r>
+        <w:rPr>
+          <w:rStyle w:val="StringTok"/>
+        </w:rPr>
+        <w:t xml:space="preserve">"s3://pg-backups/pg-main"</w:t>
+      </w:r>
+      <w:r>
+        <w:br/>
+      </w:r>
+      <w:r>
+        <w:rPr>
+          <w:rStyle w:val="AttributeTok"/>
+        </w:rPr>
+        <w:t xml:space="preserve">        </w:t>
+      </w:r>
+      <w:r>
+        <w:rPr>
+          <w:rStyle w:val="FunctionTok"/>
+        </w:rPr>
+        <w:t xml:space="preserve">endpointURL</w:t>
+      </w:r>
+      <w:r>
+        <w:rPr>
+          <w:rStyle w:val="KeywordTok"/>
+        </w:rPr>
+        <w:t xml:space="preserve">:</w:t>
+      </w:r>
+      <w:r>
+        <w:rPr>
+          <w:rStyle w:val="AttributeTok"/>
+        </w:rPr>
+        <w:t xml:space="preserve"> </w:t>
+      </w:r>
+      <w:r>
+        <w:rPr>
+          <w:rStyle w:val="StringTok"/>
+        </w:rPr>
+        <w:t xml:space="preserve">"http://seaweedfs-s3.processing.svc.cluster.local:8333"</w:t>
+      </w:r>
+      <w:r>
+        <w:br/>
+      </w:r>
+      <w:r>
+        <w:rPr>
+          <w:rStyle w:val="AttributeTok"/>
+        </w:rPr>
+        <w:t xml:space="preserve">        </w:t>
+      </w:r>
+      <w:r>
+        <w:rPr>
+          <w:rStyle w:val="FunctionTok"/>
+        </w:rPr>
+        <w:t xml:space="preserve">s3Credentials</w:t>
+      </w:r>
+      <w:r>
+        <w:rPr>
+          <w:rStyle w:val="KeywordTok"/>
+        </w:rPr>
+        <w:t xml:space="preserve">:</w:t>
+      </w:r>
+      <w:r>
+        <w:br/>
+      </w:r>
+      <w:r>
+        <w:rPr>
+          <w:rStyle w:val="AttributeTok"/>
+        </w:rPr>
+        <w:t xml:space="preserve">          </w:t>
+      </w:r>
+      <w:r>
+        <w:rPr>
+          <w:rStyle w:val="FunctionTok"/>
+        </w:rPr>
+        <w:t xml:space="preserve">accessKeyId</w:t>
+      </w:r>
+      <w:r>
+        <w:rPr>
+          <w:rStyle w:val="KeywordTok"/>
+        </w:rPr>
+        <w:t xml:space="preserve">:</w:t>
+      </w:r>
+      <w:r>
+        <w:br/>
+      </w:r>
+      <w:r>
+        <w:rPr>
+          <w:rStyle w:val="AttributeTok"/>
+        </w:rPr>
+        <w:t xml:space="preserve">            </w:t>
+      </w:r>
+      <w:r>
+        <w:rPr>
+          <w:rStyle w:val="FunctionTok"/>
+        </w:rPr>
+        <w:t xml:space="preserve">name</w:t>
+      </w:r>
+      <w:r>
+        <w:rPr>
+          <w:rStyle w:val="KeywordTok"/>
+        </w:rPr>
+        <w:t xml:space="preserve">:</w:t>
+      </w:r>
+      <w:r>
+        <w:rPr>
+          <w:rStyle w:val="AttributeTok"/>
+        </w:rPr>
+        <w:t xml:space="preserve"> pg-backup-s3-creds</w:t>
+      </w:r>
+      <w:r>
+        <w:br/>
+      </w:r>
+      <w:r>
+        <w:rPr>
+          <w:rStyle w:val="AttributeTok"/>
+        </w:rPr>
+        <w:t xml:space="preserve">            </w:t>
+      </w:r>
+      <w:r>
+        <w:rPr>
+          <w:rStyle w:val="FunctionTok"/>
+        </w:rPr>
+        <w:t xml:space="preserve">key</w:t>
+      </w:r>
+      <w:r>
+        <w:rPr>
+          <w:rStyle w:val="KeywordTok"/>
+        </w:rPr>
+        <w:t xml:space="preserve">:</w:t>
+      </w:r>
+      <w:r>
+        <w:rPr>
+          <w:rStyle w:val="AttributeTok"/>
+        </w:rPr>
+        <w:t xml:space="preserve"> accessKeyId</w:t>
+      </w:r>
+      <w:r>
+        <w:br/>
+      </w:r>
+      <w:r>
+        <w:rPr>
+          <w:rStyle w:val="AttributeTok"/>
+        </w:rPr>
+        <w:t xml:space="preserve">          </w:t>
+      </w:r>
+      <w:r>
+        <w:rPr>
+          <w:rStyle w:val="FunctionTok"/>
+        </w:rPr>
+        <w:t xml:space="preserve">secretAccessKey</w:t>
+      </w:r>
+      <w:r>
+        <w:rPr>
+          <w:rStyle w:val="KeywordTok"/>
+        </w:rPr>
+        <w:t xml:space="preserve">:</w:t>
+      </w:r>
+      <w:r>
+        <w:br/>
+      </w:r>
+      <w:r>
+        <w:rPr>
+          <w:rStyle w:val="AttributeTok"/>
+        </w:rPr>
+        <w:t xml:space="preserve">            </w:t>
+      </w:r>
+      <w:r>
+        <w:rPr>
+          <w:rStyle w:val="FunctionTok"/>
+        </w:rPr>
+        <w:t xml:space="preserve">name</w:t>
+      </w:r>
+      <w:r>
+        <w:rPr>
+          <w:rStyle w:val="KeywordTok"/>
+        </w:rPr>
+        <w:t xml:space="preserve">:</w:t>
+      </w:r>
+      <w:r>
+        <w:rPr>
+          <w:rStyle w:val="AttributeTok"/>
+        </w:rPr>
+        <w:t xml:space="preserve"> pg-backup-s3-creds</w:t>
+      </w:r>
+      <w:r>
+        <w:br/>
+      </w:r>
+      <w:r>
+        <w:rPr>
+          <w:rStyle w:val="AttributeTok"/>
+        </w:rPr>
+        <w:t xml:space="preserve">            </w:t>
+      </w:r>
+      <w:r>
+        <w:rPr>
+          <w:rStyle w:val="FunctionTok"/>
+        </w:rPr>
+        <w:t xml:space="preserve">key</w:t>
+      </w:r>
+      <w:r>
+        <w:rPr>
+          <w:rStyle w:val="KeywordTok"/>
+        </w:rPr>
+        <w:t xml:space="preserve">:</w:t>
+      </w:r>
+      <w:r>
+        <w:rPr>
+          <w:rStyle w:val="AttributeTok"/>
+        </w:rPr>
+        <w:t xml:space="preserve"> secretAccessKey</w:t>
+      </w:r>
+      <w:r>
+        <w:br/>
+      </w:r>
+      <w:r>
+        <w:rPr>
+          <w:rStyle w:val="AttributeTok"/>
+        </w:rPr>
+        <w:t xml:space="preserve">        </w:t>
+      </w:r>
+      <w:r>
+        <w:rPr>
+          <w:rStyle w:val="FunctionTok"/>
+        </w:rPr>
+        <w:t xml:space="preserve">wal</w:t>
+      </w:r>
+      <w:r>
+        <w:rPr>
+          <w:rStyle w:val="KeywordTok"/>
+        </w:rPr>
+        <w:t xml:space="preserve">:</w:t>
+      </w:r>
+      <w:r>
+        <w:br/>
+      </w:r>
+      <w:r>
+        <w:rPr>
+          <w:rStyle w:val="AttributeTok"/>
+        </w:rPr>
+        <w:t xml:space="preserve">          </w:t>
+      </w:r>
+      <w:r>
+        <w:rPr>
+          <w:rStyle w:val="FunctionTok"/>
+        </w:rPr>
+        <w:t xml:space="preserve">maxParallel</w:t>
+      </w:r>
+      <w:r>
+        <w:rPr>
+          <w:rStyle w:val="KeywordTok"/>
+        </w:rPr>
+        <w:t xml:space="preserve">:</w:t>
+      </w:r>
+      <w:r>
+        <w:rPr>
+          <w:rStyle w:val="AttributeTok"/>
+        </w:rPr>
+        <w:t xml:space="preserve"> </w:t>
+      </w:r>
+      <w:r>
+        <w:rPr>
+          <w:rStyle w:val="DecValTok"/>
+        </w:rPr>
+        <w:t xml:space="preserve">2</w:t>
+      </w:r>
+    </w:p>
+    <w:bookmarkEnd w:id="21"/>
+    <w:bookmarkStart w:id="22" w:name="X87d19ab5fb5291ae609f18a3804a88a73eff9c3"/>
+    <w:p>
+      <w:pPr>
+        <w:pStyle w:val="Heading3"/>
+      </w:pPr>
+      <w:r>
+        <w:t xml:space="preserve">5.3 복구 실행</w:t>
+      </w:r>
+    </w:p>
+    <w:p>
+      <w:pPr>
+        <w:pStyle w:val="SourceCode"/>
+      </w:pPr>
+      <w:r>
+        <w:rPr>
+          <w:rStyle w:val="CommentTok"/>
+        </w:rPr>
+        <w:t xml:space="preserve"># 1. Secret 확인 (이미 있어야 함)</w:t>
+      </w:r>
+      <w:r>
+        <w:br/>
+      </w:r>
+      <w:r>
+        <w:rPr>
+          <w:rStyle w:val="ExtensionTok"/>
+        </w:rPr>
+        <w:t xml:space="preserve">kubectl</w:t>
+      </w:r>
+      <w:r>
+        <w:rPr>
+          <w:rStyle w:val="NormalTok"/>
+        </w:rPr>
+        <w:t xml:space="preserve"> </w:t>
+      </w:r>
+      <w:r>
+        <w:rPr>
+          <w:rStyle w:val="AttributeTok"/>
+        </w:rPr>
+        <w:t xml:space="preserve">-n</w:t>
+      </w:r>
+      <w:r>
+        <w:rPr>
+          <w:rStyle w:val="NormalTok"/>
+        </w:rPr>
+        <w:t xml:space="preserve"> processing get secret pg-backup-s3-creds</w:t>
+      </w:r>
+      <w:r>
+        <w:br/>
+      </w:r>
+      <w:r>
+        <w:br/>
+      </w:r>
+      <w:r>
+        <w:rPr>
+          <w:rStyle w:val="CommentTok"/>
+        </w:rPr>
+        <w:t xml:space="preserve"># 2. 복구 Cluster 적용</w:t>
+      </w:r>
+      <w:r>
+        <w:br/>
+      </w:r>
+      <w:r>
+        <w:rPr>
+          <w:rStyle w:val="ExtensionTok"/>
+        </w:rPr>
+        <w:t xml:space="preserve">kubectl</w:t>
+      </w:r>
+      <w:r>
+        <w:rPr>
+          <w:rStyle w:val="NormalTok"/>
+        </w:rPr>
+        <w:t xml:space="preserve"> apply </w:t>
+      </w:r>
+      <w:r>
+        <w:rPr>
+          <w:rStyle w:val="AttributeTok"/>
+        </w:rPr>
+        <w:t xml:space="preserve">-f</w:t>
+      </w:r>
+      <w:r>
+        <w:rPr>
+          <w:rStyle w:val="NormalTok"/>
+        </w:rPr>
+        <w:t xml:space="preserve"> pg-main-restore.yaml</w:t>
+      </w:r>
+      <w:r>
+        <w:br/>
+      </w:r>
+      <w:r>
+        <w:br/>
+      </w:r>
+      <w:r>
+        <w:rPr>
+          <w:rStyle w:val="CommentTok"/>
+        </w:rPr>
+        <w:t xml:space="preserve"># 3. 복구 완료 대기</w:t>
+      </w:r>
+      <w:r>
+        <w:br/>
+      </w:r>
+      <w:r>
+        <w:rPr>
+          <w:rStyle w:val="ExtensionTok"/>
+        </w:rPr>
+        <w:t xml:space="preserve">kubectl</w:t>
+      </w:r>
+      <w:r>
+        <w:rPr>
+          <w:rStyle w:val="NormalTok"/>
+        </w:rPr>
+        <w:t xml:space="preserve"> </w:t>
+      </w:r>
+      <w:r>
+        <w:rPr>
+          <w:rStyle w:val="AttributeTok"/>
+        </w:rPr>
+        <w:t xml:space="preserve">-n</w:t>
+      </w:r>
+      <w:r>
+        <w:rPr>
+          <w:rStyle w:val="NormalTok"/>
+        </w:rPr>
+        <w:t xml:space="preserve"> processing wait </w:t>
+      </w:r>
+      <w:r>
+        <w:rPr>
+          <w:rStyle w:val="AttributeTok"/>
+        </w:rPr>
+        <w:t xml:space="preserve">--for</w:t>
+      </w:r>
+      <w:r>
+        <w:rPr>
+          <w:rStyle w:val="OperatorTok"/>
+        </w:rPr>
+        <w:t xml:space="preserve">=</w:t>
+      </w:r>
+      <w:r>
+        <w:rPr>
+          <w:rStyle w:val="NormalTok"/>
+        </w:rPr>
+        <w:t xml:space="preserve">condition=Ready </w:t>
+      </w:r>
+      <w:r>
+        <w:rPr>
+          <w:rStyle w:val="DataTypeTok"/>
+        </w:rPr>
+        <w:t xml:space="preserve">\</w:t>
+      </w:r>
+      <w:r>
+        <w:br/>
+      </w:r>
+      <w:r>
+        <w:rPr>
+          <w:rStyle w:val="NormalTok"/>
+        </w:rPr>
+        <w:t xml:space="preserve">  cluster/pg-main-restore </w:t>
+      </w:r>
+      <w:r>
+        <w:rPr>
+          <w:rStyle w:val="AttributeTok"/>
+        </w:rPr>
+        <w:t xml:space="preserve">--timeout</w:t>
+      </w:r>
+      <w:r>
+        <w:rPr>
+          <w:rStyle w:val="OperatorTok"/>
+        </w:rPr>
+        <w:t xml:space="preserve">=</w:t>
+      </w:r>
+      <w:r>
+        <w:rPr>
+          <w:rStyle w:val="NormalTok"/>
+        </w:rPr>
+        <w:t xml:space="preserve">600s</w:t>
+      </w:r>
+      <w:r>
+        <w:br/>
+      </w:r>
+      <w:r>
+        <w:br/>
+      </w:r>
+      <w:r>
+        <w:rPr>
+          <w:rStyle w:val="CommentTok"/>
+        </w:rPr>
+        <w:t xml:space="preserve"># 4. 데이터 검증</w:t>
+      </w:r>
+      <w:r>
+        <w:br/>
+      </w:r>
+      <w:r>
+        <w:rPr>
+          <w:rStyle w:val="ExtensionTok"/>
+        </w:rPr>
+        <w:t xml:space="preserve">kubectl</w:t>
+      </w:r>
+      <w:r>
+        <w:rPr>
+          <w:rStyle w:val="NormalTok"/>
+        </w:rPr>
+        <w:t xml:space="preserve"> </w:t>
+      </w:r>
+      <w:r>
+        <w:rPr>
+          <w:rStyle w:val="AttributeTok"/>
+        </w:rPr>
+        <w:t xml:space="preserve">-n</w:t>
+      </w:r>
+      <w:r>
+        <w:rPr>
+          <w:rStyle w:val="NormalTok"/>
+        </w:rPr>
+        <w:t xml:space="preserve"> processing exec pg-main-restore-1 </w:t>
+      </w:r>
+      <w:r>
+        <w:rPr>
+          <w:rStyle w:val="AttributeTok"/>
+        </w:rPr>
+        <w:t xml:space="preserve">-c</w:t>
+      </w:r>
+      <w:r>
+        <w:rPr>
+          <w:rStyle w:val="NormalTok"/>
+        </w:rPr>
+        <w:t xml:space="preserve"> postgres </w:t>
+      </w:r>
+      <w:r>
+        <w:rPr>
+          <w:rStyle w:val="AttributeTok"/>
+        </w:rPr>
+        <w:t xml:space="preserve">--</w:t>
+      </w:r>
+      <w:r>
+        <w:rPr>
+          <w:rStyle w:val="NormalTok"/>
+        </w:rPr>
+        <w:t xml:space="preserve"> </w:t>
+      </w:r>
+      <w:r>
+        <w:rPr>
+          <w:rStyle w:val="DataTypeTok"/>
+        </w:rPr>
+        <w:t xml:space="preserve">\</w:t>
+      </w:r>
+      <w:r>
+        <w:br/>
+      </w:r>
+      <w:r>
+        <w:rPr>
+          <w:rStyle w:val="NormalTok"/>
+        </w:rPr>
+        <w:t xml:space="preserve">  psql </w:t>
+      </w:r>
+      <w:r>
+        <w:rPr>
+          <w:rStyle w:val="AttributeTok"/>
+        </w:rPr>
+        <w:t xml:space="preserve">-U</w:t>
+      </w:r>
+      <w:r>
+        <w:rPr>
+          <w:rStyle w:val="NormalTok"/>
+        </w:rPr>
+        <w:t xml:space="preserve"> postgres </w:t>
+      </w:r>
+      <w:r>
+        <w:rPr>
+          <w:rStyle w:val="AttributeTok"/>
+        </w:rPr>
+        <w:t xml:space="preserve">-d</w:t>
+      </w:r>
+      <w:r>
+        <w:rPr>
+          <w:rStyle w:val="NormalTok"/>
+        </w:rPr>
+        <w:t xml:space="preserve"> ocr </w:t>
+      </w:r>
+      <w:r>
+        <w:rPr>
+          <w:rStyle w:val="AttributeTok"/>
+        </w:rPr>
+        <w:t xml:space="preserve">-c</w:t>
+      </w:r>
+      <w:r>
+        <w:rPr>
+          <w:rStyle w:val="NormalTok"/>
+        </w:rPr>
+        <w:t xml:space="preserve"> </w:t>
+      </w:r>
+      <w:r>
+        <w:rPr>
+          <w:rStyle w:val="StringTok"/>
+        </w:rPr>
+        <w:t xml:space="preserve">"SELECT count(*) FROM &lt;핵심 테이블&gt;;"</w:t>
+      </w:r>
+      <w:r>
+        <w:br/>
+      </w:r>
+      <w:r>
+        <w:br/>
+      </w:r>
+      <w:r>
+        <w:rPr>
+          <w:rStyle w:val="CommentTok"/>
+        </w:rPr>
+        <w:t xml:space="preserve"># 5. (선택) 서비스 전환 — pg-main Service가 pg-main-restore를 가리키도록 변경</w:t>
+      </w:r>
+      <w:r>
+        <w:br/>
+      </w:r>
+      <w:r>
+        <w:rPr>
+          <w:rStyle w:val="CommentTok"/>
+        </w:rPr>
+        <w:t xml:space="preserve">#    또는 pg-main 삭제 후 pg-main-restore를 pg-main으로 rename (PVC 유지 주의)</w:t>
+      </w:r>
+    </w:p>
+    <w:p>
+      <w:pPr>
+        <w:pStyle w:val="BlockText"/>
+      </w:pPr>
+      <w:r>
+        <w:rPr>
+          <w:b/>
+          <w:bCs/>
+        </w:rPr>
+        <w:t xml:space="preserve">주의</w:t>
+      </w:r>
+      <w:r>
+        <w:t xml:space="preserve">: 복구 Cluster는 기존</w:t>
+      </w:r>
+      <w:r>
+        <w:t xml:space="preserve"> </w:t>
+      </w:r>
+      <w:r>
+        <w:rPr>
+          <w:rStyle w:val="VerbatimChar"/>
+        </w:rPr>
+        <w:t xml:space="preserve">pg-main</w:t>
+      </w:r>
+      <w:r>
+        <w:t xml:space="preserve">과</w:t>
+      </w:r>
+      <w:r>
+        <w:t xml:space="preserve"> </w:t>
+      </w:r>
+      <w:r>
+        <w:rPr>
+          <w:b/>
+          <w:bCs/>
+        </w:rPr>
+        <w:t xml:space="preserve">동시에 존재</w:t>
+      </w:r>
+      <w:r>
+        <w:t xml:space="preserve"> </w:t>
+      </w:r>
+      <w:r>
+        <w:t xml:space="preserve">가능.</w:t>
+      </w:r>
+      <w:r>
+        <w:t xml:space="preserve"> </w:t>
+      </w:r>
+      <w:r>
+        <w:t xml:space="preserve">검증 완료 후 기존 클러스터 삭제 여부를 수동으로 결정할 것.</w:t>
+      </w:r>
+    </w:p>
+    <w:bookmarkEnd w:id="22"/>
+    <w:bookmarkStart w:id="23" w:name="X2f23ed36f6d8f183452f50300e1abe9fdf27dea"/>
+    <w:p>
+      <w:pPr>
+        <w:pStyle w:val="Heading3"/>
+      </w:pPr>
+      <w:r>
+        <w:t xml:space="preserve">5.4 복구 후 정리</w:t>
+      </w:r>
+    </w:p>
+    <w:p>
+      <w:pPr>
+        <w:pStyle w:val="SourceCode"/>
+      </w:pPr>
+      <w:r>
+        <w:rPr>
+          <w:rStyle w:val="CommentTok"/>
+        </w:rPr>
+        <w:t xml:space="preserve"># 검증 완료 시 복구 클러스터 삭제</w:t>
+      </w:r>
+      <w:r>
+        <w:br/>
+      </w:r>
+      <w:r>
+        <w:rPr>
+          <w:rStyle w:val="ExtensionTok"/>
+        </w:rPr>
+        <w:t xml:space="preserve">kubectl</w:t>
+      </w:r>
+      <w:r>
+        <w:rPr>
+          <w:rStyle w:val="NormalTok"/>
+        </w:rPr>
+        <w:t xml:space="preserve"> </w:t>
+      </w:r>
+      <w:r>
+        <w:rPr>
+          <w:rStyle w:val="AttributeTok"/>
+        </w:rPr>
+        <w:t xml:space="preserve">-n</w:t>
+      </w:r>
+      <w:r>
+        <w:rPr>
+          <w:rStyle w:val="NormalTok"/>
+        </w:rPr>
+        <w:t xml:space="preserve"> processing delete cluster pg-main-restore</w:t>
+      </w:r>
+    </w:p>
+    <w:p>
+      <w:r>
+        <w:pict>
+          <v:rect style="width:0;height:1.5pt" o:hralign="center" o:hrstd="t" o:hr="t"/>
+        </w:pict>
+      </w:r>
+    </w:p>
+    <w:bookmarkEnd w:id="23"/>
+    <w:bookmarkEnd w:id="24"/>
+    <w:bookmarkStart w:id="28" w:name="X901c2e916f52db366c5732676772dbd7590499b"/>
+    <w:p>
+      <w:pPr>
+        <w:pStyle w:val="Heading2"/>
+      </w:pPr>
+      <w:r>
+        <w:t xml:space="preserve">7. 장애 대응 시나리오</w:t>
+      </w:r>
+    </w:p>
+    <w:bookmarkStart w:id="25" w:name="Xac14be6231098aab186dfc612ea5bf3fd20023a"/>
+    <w:p>
+      <w:pPr>
+        <w:pStyle w:val="Heading3"/>
+      </w:pPr>
+      <w:r>
+        <w:t xml:space="preserve">6.1 WAL 아카이빙 실패</w:t>
+      </w:r>
+    </w:p>
+    <w:p>
+      <w:pPr>
+        <w:pStyle w:val="FirstParagraph"/>
+      </w:pPr>
+      <w:r>
+        <w:rPr>
+          <w:b/>
+          <w:bCs/>
+        </w:rPr>
+        <w:t xml:space="preserve">증상</w:t>
+      </w:r>
+      <w:r>
+        <w:t xml:space="preserve">:</w:t>
+      </w:r>
+      <w:r>
+        <w:t xml:space="preserve"> </w:t>
+      </w:r>
+      <w:r>
+        <w:rPr>
+          <w:rStyle w:val="VerbatimChar"/>
+        </w:rPr>
+        <w:t xml:space="preserve">pg_stat_archiver.failed_count &gt; 0</w:t>
+      </w:r>
+      <w:r>
+        <w:t xml:space="preserve"> </w:t>
+      </w:r>
+      <w:r>
+        <w:t xml:space="preserve">또는</w:t>
+      </w:r>
+      <w:r>
+        <w:t xml:space="preserve"> </w:t>
+      </w:r>
+      <w:r>
+        <w:rPr>
+          <w:rStyle w:val="VerbatimChar"/>
+        </w:rPr>
+        <w:t xml:space="preserve">ContinuousArchiving: False</w:t>
+      </w:r>
+    </w:p>
+    <w:p>
+      <w:pPr>
+        <w:pStyle w:val="BodyText"/>
+      </w:pPr>
+      <w:r>
+        <w:rPr>
+          <w:b/>
+          <w:bCs/>
+        </w:rPr>
+        <w:t xml:space="preserve">원인 확인</w:t>
+      </w:r>
+      <w:r>
+        <w:t xml:space="preserve">:</w:t>
+      </w:r>
+    </w:p>
+    <w:p>
+      <w:pPr>
+        <w:pStyle w:val="SourceCode"/>
+      </w:pPr>
+      <w:r>
+        <w:rPr>
+          <w:rStyle w:val="CommentTok"/>
+        </w:rPr>
+        <w:t xml:space="preserve"># CNPG 컨트롤러 로그</w:t>
+      </w:r>
+      <w:r>
+        <w:br/>
+      </w:r>
+      <w:r>
+        <w:rPr>
+          <w:rStyle w:val="ExtensionTok"/>
+        </w:rPr>
+        <w:t xml:space="preserve">kubectl</w:t>
+      </w:r>
+      <w:r>
+        <w:rPr>
+          <w:rStyle w:val="NormalTok"/>
+        </w:rPr>
+        <w:t xml:space="preserve"> </w:t>
+      </w:r>
+      <w:r>
+        <w:rPr>
+          <w:rStyle w:val="AttributeTok"/>
+        </w:rPr>
+        <w:t xml:space="preserve">-n</w:t>
+      </w:r>
+      <w:r>
+        <w:rPr>
+          <w:rStyle w:val="NormalTok"/>
+        </w:rPr>
+        <w:t xml:space="preserve"> cnpg-system logs </w:t>
+      </w:r>
+      <w:r>
+        <w:rPr>
+          <w:rStyle w:val="AttributeTok"/>
+        </w:rPr>
+        <w:t xml:space="preserve">-l</w:t>
+      </w:r>
+      <w:r>
+        <w:rPr>
+          <w:rStyle w:val="NormalTok"/>
+        </w:rPr>
+        <w:t xml:space="preserve"> app.kubernetes.io/name=cloudnative-pg </w:t>
+      </w:r>
+      <w:r>
+        <w:rPr>
+          <w:rStyle w:val="AttributeTok"/>
+        </w:rPr>
+        <w:t xml:space="preserve">--tail</w:t>
+      </w:r>
+      <w:r>
+        <w:rPr>
+          <w:rStyle w:val="OperatorTok"/>
+        </w:rPr>
+        <w:t xml:space="preserve">=</w:t>
+      </w:r>
+      <w:r>
+        <w:rPr>
+          <w:rStyle w:val="NormalTok"/>
+        </w:rPr>
+        <w:t xml:space="preserve">50</w:t>
+      </w:r>
+      <w:r>
+        <w:br/>
+      </w:r>
+      <w:r>
+        <w:br/>
+      </w:r>
+      <w:r>
+        <w:rPr>
+          <w:rStyle w:val="CommentTok"/>
+        </w:rPr>
+        <w:t xml:space="preserve"># pg-main-1 pod 내 barman-cloud-wal-archive 로그</w:t>
+      </w:r>
+      <w:r>
+        <w:br/>
+      </w:r>
+      <w:r>
+        <w:rPr>
+          <w:rStyle w:val="ExtensionTok"/>
+        </w:rPr>
+        <w:t xml:space="preserve">kubectl</w:t>
+      </w:r>
+      <w:r>
+        <w:rPr>
+          <w:rStyle w:val="NormalTok"/>
+        </w:rPr>
+        <w:t xml:space="preserve"> </w:t>
+      </w:r>
+      <w:r>
+        <w:rPr>
+          <w:rStyle w:val="AttributeTok"/>
+        </w:rPr>
+        <w:t xml:space="preserve">-n</w:t>
+      </w:r>
+      <w:r>
+        <w:rPr>
+          <w:rStyle w:val="NormalTok"/>
+        </w:rPr>
+        <w:t xml:space="preserve"> processing logs pg-main-1 </w:t>
+      </w:r>
+      <w:r>
+        <w:rPr>
+          <w:rStyle w:val="AttributeTok"/>
+        </w:rPr>
+        <w:t xml:space="preserve">-c</w:t>
+      </w:r>
+      <w:r>
+        <w:rPr>
+          <w:rStyle w:val="NormalTok"/>
+        </w:rPr>
+        <w:t xml:space="preserve"> postgres </w:t>
+      </w:r>
+      <w:r>
+        <w:rPr>
+          <w:rStyle w:val="AttributeTok"/>
+        </w:rPr>
+        <w:t xml:space="preserve">--tail</w:t>
+      </w:r>
+      <w:r>
+        <w:rPr>
+          <w:rStyle w:val="OperatorTok"/>
+        </w:rPr>
+        <w:t xml:space="preserve">=</w:t>
+      </w:r>
+      <w:r>
+        <w:rPr>
+          <w:rStyle w:val="NormalTok"/>
+        </w:rPr>
+        <w:t xml:space="preserve">100 </w:t>
+      </w:r>
+      <w:r>
+        <w:rPr>
+          <w:rStyle w:val="KeywordTok"/>
+        </w:rPr>
+        <w:t xml:space="preserve">|</w:t>
+      </w:r>
+      <w:r>
+        <w:rPr>
+          <w:rStyle w:val="NormalTok"/>
+        </w:rPr>
+        <w:t xml:space="preserve"> </w:t>
+      </w:r>
+      <w:r>
+        <w:rPr>
+          <w:rStyle w:val="FunctionTok"/>
+        </w:rPr>
+        <w:t xml:space="preserve">grep</w:t>
+      </w:r>
+      <w:r>
+        <w:rPr>
+          <w:rStyle w:val="NormalTok"/>
+        </w:rPr>
+        <w:t xml:space="preserve"> </w:t>
+      </w:r>
+      <w:r>
+        <w:rPr>
+          <w:rStyle w:val="AttributeTok"/>
+        </w:rPr>
+        <w:t xml:space="preserve">-i</w:t>
+      </w:r>
+      <w:r>
+        <w:rPr>
+          <w:rStyle w:val="NormalTok"/>
+        </w:rPr>
+        <w:t xml:space="preserve"> </w:t>
+      </w:r>
+      <w:r>
+        <w:rPr>
+          <w:rStyle w:val="StringTok"/>
+        </w:rPr>
+        <w:t xml:space="preserve">"barman\|archive\|error"</w:t>
+      </w:r>
+    </w:p>
+    <w:p>
+      <w:pPr>
+        <w:pStyle w:val="FirstParagraph"/>
+      </w:pPr>
+      <w:r>
+        <w:rPr>
+          <w:b/>
+          <w:bCs/>
+        </w:rPr>
+        <w:t xml:space="preserve">대응</w:t>
+      </w:r>
+      <w:r>
+        <w:t xml:space="preserve">:</w:t>
+      </w:r>
+    </w:p>
+    <w:p>
+      <w:pPr>
+        <w:pStyle w:val="Compact"/>
+        <w:numPr>
+          <w:ilvl w:val="0"/>
+          <w:numId w:val="1003"/>
+        </w:numPr>
+      </w:pPr>
+      <w:r>
+        <w:t xml:space="preserve">SeaweedFS S3 서비스 상태 확인:</w:t>
+      </w:r>
+      <w:r>
+        <w:t xml:space="preserve"> </w:t>
+      </w:r>
+      <w:r>
+        <w:rPr>
+          <w:rStyle w:val="VerbatimChar"/>
+        </w:rPr>
+        <w:t xml:space="preserve">kubectl -n processing get pod -l app.kubernetes.io/name=seaweedfs</w:t>
+      </w:r>
+    </w:p>
+    <w:p>
+      <w:pPr>
+        <w:pStyle w:val="Compact"/>
+        <w:numPr>
+          <w:ilvl w:val="0"/>
+          <w:numId w:val="1003"/>
+        </w:numPr>
+      </w:pPr>
+      <w:r>
+        <w:t xml:space="preserve">Secret 자격증명 확인:</w:t>
+      </w:r>
+      <w:r>
+        <w:t xml:space="preserve"> </w:t>
+      </w:r>
+      <w:r>
+        <w:rPr>
+          <w:rStyle w:val="VerbatimChar"/>
+        </w:rPr>
+        <w:t xml:space="preserve">kubectl -n processing get secret pg-backup-s3-creds -o jsonpath='{.data.accessKeyId}' | base64 -d</w:t>
+      </w:r>
+    </w:p>
+    <w:p>
+      <w:pPr>
+        <w:pStyle w:val="Compact"/>
+        <w:numPr>
+          <w:ilvl w:val="0"/>
+          <w:numId w:val="1003"/>
+        </w:numPr>
+      </w:pPr>
+      <w:r>
+        <w:t xml:space="preserve">버킷 존재 확인 (§3.4 참조)</w:t>
+      </w:r>
+    </w:p>
+    <w:p>
+      <w:pPr>
+        <w:pStyle w:val="Compact"/>
+        <w:numPr>
+          <w:ilvl w:val="0"/>
+          <w:numId w:val="1003"/>
+        </w:numPr>
+      </w:pPr>
+      <w:r>
+        <w:t xml:space="preserve">NetworkPolicy 확인:</w:t>
+      </w:r>
+      <w:r>
+        <w:t xml:space="preserve"> </w:t>
+      </w:r>
+      <w:r>
+        <w:rPr>
+          <w:rStyle w:val="VerbatimChar"/>
+        </w:rPr>
+        <w:t xml:space="preserve">kubectl -n processing get networkpolicy allow-intra-namespace</w:t>
+      </w:r>
+    </w:p>
+    <w:bookmarkEnd w:id="25"/>
+    <w:bookmarkStart w:id="26" w:name="X3261559a5a1bf40ccb56fbee162171575b3962c"/>
+    <w:p>
+      <w:pPr>
+        <w:pStyle w:val="Heading3"/>
+      </w:pPr>
+      <w:r>
+        <w:t xml:space="preserve">6.2 ScheduledBackup 미실행</w:t>
+      </w:r>
+    </w:p>
+    <w:p>
+      <w:pPr>
+        <w:pStyle w:val="FirstParagraph"/>
+      </w:pPr>
+      <w:r>
+        <w:rPr>
+          <w:b/>
+          <w:bCs/>
+        </w:rPr>
+        <w:t xml:space="preserve">증상</w:t>
+      </w:r>
+      <w:r>
+        <w:t xml:space="preserve">:</w:t>
+      </w:r>
+      <w:r>
+        <w:t xml:space="preserve"> </w:t>
+      </w:r>
+      <w:r>
+        <w:rPr>
+          <w:rStyle w:val="VerbatimChar"/>
+        </w:rPr>
+        <w:t xml:space="preserve">kubectl -n processing get scheduledbackup pg-main-daily</w:t>
+      </w:r>
+      <w:r>
+        <w:t xml:space="preserve"> </w:t>
+      </w:r>
+      <w:r>
+        <w:t xml:space="preserve">의</w:t>
+      </w:r>
+      <w:r>
+        <w:t xml:space="preserve"> </w:t>
+      </w:r>
+      <w:r>
+        <w:rPr>
+          <w:rStyle w:val="VerbatimChar"/>
+        </w:rPr>
+        <w:t xml:space="preserve">lastBackupTime</w:t>
+      </w:r>
+      <w:r>
+        <w:t xml:space="preserve"> </w:t>
+      </w:r>
+      <w:r>
+        <w:t xml:space="preserve">갱신 안 됨</w:t>
+      </w:r>
+    </w:p>
+    <w:p>
+      <w:pPr>
+        <w:pStyle w:val="BodyText"/>
+      </w:pPr>
+      <w:r>
+        <w:rPr>
+          <w:b/>
+          <w:bCs/>
+        </w:rPr>
+        <w:t xml:space="preserve">원인 확인</w:t>
+      </w:r>
+      <w:r>
+        <w:t xml:space="preserve">:</w:t>
+      </w:r>
+    </w:p>
+    <w:p>
+      <w:pPr>
+        <w:pStyle w:val="SourceCode"/>
+      </w:pPr>
+      <w:r>
+        <w:rPr>
+          <w:rStyle w:val="ExtensionTok"/>
+        </w:rPr>
+        <w:t xml:space="preserve">kubectl</w:t>
+      </w:r>
+      <w:r>
+        <w:rPr>
+          <w:rStyle w:val="NormalTok"/>
+        </w:rPr>
+        <w:t xml:space="preserve"> </w:t>
+      </w:r>
+      <w:r>
+        <w:rPr>
+          <w:rStyle w:val="AttributeTok"/>
+        </w:rPr>
+        <w:t xml:space="preserve">-n</w:t>
+      </w:r>
+      <w:r>
+        <w:rPr>
+          <w:rStyle w:val="NormalTok"/>
+        </w:rPr>
+        <w:t xml:space="preserve"> processing describe scheduledbackup pg-main-daily</w:t>
+      </w:r>
+    </w:p>
+    <w:p>
+      <w:pPr>
+        <w:pStyle w:val="FirstParagraph"/>
+      </w:pPr>
+      <w:r>
+        <w:rPr>
+          <w:b/>
+          <w:bCs/>
+        </w:rPr>
+        <w:t xml:space="preserve">대응</w:t>
+      </w:r>
+      <w:r>
+        <w:t xml:space="preserve">: 수동 백업 실행 (§4) 후 스케줄 설정 재검토.</w:t>
+      </w:r>
+    </w:p>
+    <w:bookmarkEnd w:id="26"/>
+    <w:bookmarkStart w:id="27" w:name="X8e0b6a1530d680824839105aec2b58c21b43f14"/>
+    <w:p>
+      <w:pPr>
+        <w:pStyle w:val="Heading3"/>
+      </w:pPr>
+      <w:r>
+        <w:t xml:space="preserve">6.3 SeaweedFS S3 다운</w:t>
+      </w:r>
+    </w:p>
+    <w:p>
+      <w:pPr>
+        <w:pStyle w:val="FirstParagraph"/>
+      </w:pPr>
+      <w:r>
+        <w:rPr>
+          <w:b/>
+          <w:bCs/>
+        </w:rPr>
+        <w:t xml:space="preserve">임시 조치</w:t>
+      </w:r>
+      <w:r>
+        <w:t xml:space="preserve">: WAL은 로컬에 누적됨 (</w:t>
+      </w:r>
+      <w:r>
+        <w:rPr>
+          <w:rStyle w:val="VerbatimChar"/>
+        </w:rPr>
+        <w:t xml:space="preserve">wal_keep_size: 512MB</w:t>
+      </w:r>
+      <w:r>
+        <w:t xml:space="preserve">). 서비스 복구 후 자동 재전송.</w:t>
+      </w:r>
+      <w:r>
+        <w:t xml:space="preserve"> </w:t>
+      </w:r>
+      <w:r>
+        <w:rPr>
+          <w:b/>
+          <w:bCs/>
+        </w:rPr>
+        <w:t xml:space="preserve">장기 조치</w:t>
+      </w:r>
+      <w:r>
+        <w:t xml:space="preserve">: SeaweedFS 복구 절차 (</w:t>
+      </w:r>
+      <w:r>
+        <w:rPr>
+          <w:rStyle w:val="VerbatimChar"/>
+        </w:rPr>
+        <w:t xml:space="preserve">docs/ops/seaweedfs-recovery.md</w:t>
+      </w:r>
+      <w:r>
+        <w:t xml:space="preserve"> </w:t>
+      </w:r>
+      <w:r>
+        <w:t xml:space="preserve">참조 — 미작성).</w:t>
+      </w:r>
+    </w:p>
+    <w:p>
+      <w:r>
+        <w:pict>
+          <v:rect style="width:0;height:1.5pt" o:hralign="center" o:hrstd="t" o:hr="t"/>
+        </w:pict>
+      </w:r>
+    </w:p>
+    <w:bookmarkEnd w:id="27"/>
+    <w:bookmarkEnd w:id="28"/>
+    <w:bookmarkStart w:id="29" w:name="X74921b297f9cec385a313587c57cd79abc1c23f"/>
+    <w:p>
+      <w:pPr>
+        <w:pStyle w:val="Heading2"/>
+      </w:pPr>
+      <w:r>
+        <w:t xml:space="preserve">8. 운영 체크리스트 (일별)</w:t>
+      </w:r>
+    </w:p>
+    <w:p>
+      <w:pPr>
+        <w:pStyle w:val="Compact"/>
+        <w:numPr>
+          <w:ilvl w:val="0"/>
+          <w:numId w:val="1004"/>
+        </w:numPr>
+      </w:pPr>
+      <w:r>
+        <w:rPr>
+          <w:rStyle w:val="VerbatimChar"/>
+        </w:rPr>
+        <w:t xml:space="preserve">pg_stat_archiver.failed_count = 0</w:t>
+      </w:r>
+      <w:r>
+        <w:t xml:space="preserve"> </w:t>
+      </w:r>
+      <w:r>
+        <w:t xml:space="preserve">확인</w:t>
+      </w:r>
+    </w:p>
+    <w:p>
+      <w:pPr>
+        <w:pStyle w:val="Compact"/>
+        <w:numPr>
+          <w:ilvl w:val="0"/>
+          <w:numId w:val="1005"/>
+        </w:numPr>
+      </w:pPr>
+      <w:r>
+        <w:t xml:space="preserve">전날 ScheduledBackup</w:t>
+      </w:r>
+      <w:r>
+        <w:t xml:space="preserve"> </w:t>
+      </w:r>
+      <w:r>
+        <w:rPr>
+          <w:rStyle w:val="VerbatimChar"/>
+        </w:rPr>
+        <w:t xml:space="preserve">phase=completed</w:t>
+      </w:r>
+      <w:r>
+        <w:t xml:space="preserve"> </w:t>
+      </w:r>
+      <w:r>
+        <w:t xml:space="preserve">확인</w:t>
+      </w:r>
+    </w:p>
+    <w:p>
+      <w:pPr>
+        <w:pStyle w:val="Compact"/>
+        <w:numPr>
+          <w:ilvl w:val="0"/>
+          <w:numId w:val="1006"/>
+        </w:numPr>
+      </w:pPr>
+      <w:r>
+        <w:t xml:space="preserve">S3 버킷 사용량 모니터링 (SeaweedFS 용량 대비 14일치 보존)</w:t>
+      </w:r>
+    </w:p>
+    <w:p>
+      <w:r>
+        <w:pict>
+          <v:rect style="width:0;height:1.5pt" o:hralign="center" o:hrstd="t" o:hr="t"/>
+        </w:pict>
+      </w:r>
+    </w:p>
+    <w:bookmarkEnd w:id="29"/>
+    <w:bookmarkStart w:id="30" w:name="Xbbdb0891cbbe1dc00acb009278bf53b31a4f920"/>
+    <w:p>
+      <w:pPr>
+        <w:pStyle w:val="Heading2"/>
+      </w:pPr>
+      <w:r>
+        <w:t xml:space="preserve">9. 관련 파일</w:t>
+      </w:r>
+    </w:p>
+    <w:tbl>
+      <w:tblPr>
+        <w:tblStyle w:val="Table"/>
+        <w:tblW w:type="auto" w:w="0"/>
+        <w:tblLook w:firstRow="1" w:lastRow="0" w:firstColumn="0" w:lastColumn="0" w:noHBand="0" w:noVBand="0" w:val="0020"/>
+      </w:tblPr>
+      <w:tblGrid>
+        <w:gridCol w:w="3960"/>
+        <w:gridCol w:w="3960"/>
+      </w:tblGrid>
+      <w:tr>
+        <w:trPr>
+          <w:tblHeader w:val="on"/>
+        </w:trPr>
+        <w:tc>
+          <w:tcPr/>
+          <w:p>
+            <w:pPr>
+              <w:pStyle w:val="Compact"/>
+            </w:pPr>
+            <w:r>
               <w:t xml:space="preserve">파일</w:t>
             </w:r>
           </w:p>
@@ -4338,14 +4821,14 @@
         </w:pict>
       </w:r>
     </w:p>
-    <w:bookmarkEnd w:id="27"/>
-    <w:bookmarkStart w:id="28" w:name="Xed56df2ea9646519eb2003c197e73f035f6ebf4"/>
+    <w:bookmarkEnd w:id="30"/>
+    <w:bookmarkStart w:id="31" w:name="Xd1b2511c58e0bb0689333a202fafd437dae8471"/>
     <w:p>
       <w:pPr>
         <w:pStyle w:val="Heading2"/>
       </w:pPr>
       <w:r>
-        <w:t xml:space="preserve">9. barman-cloud 버전 메모</w:t>
+        <w:t xml:space="preserve">10. barman-cloud 버전 메모</w:t>
       </w:r>
     </w:p>
     <w:p>
@@ -4601,14 +5084,14 @@
         </w:pict>
       </w:r>
     </w:p>
-    <w:bookmarkEnd w:id="28"/>
-    <w:bookmarkStart w:id="29" w:name="Xb5ddb6c539fd610e2de7f22624106d21a8b83a2"/>
+    <w:bookmarkEnd w:id="31"/>
+    <w:bookmarkStart w:id="32" w:name="X5371651b1f615c110191accbeb4e1dd7262a84f"/>
     <w:p>
       <w:pPr>
         <w:pStyle w:val="Heading2"/>
       </w:pPr>
       <w:r>
-        <w:t xml:space="preserve">10. Phase 2 이관 계획 (ESO → OpenBao KV)</w:t>
+        <w:t xml:space="preserve">11. Phase 2 이관 계획 (ESO → OpenBao KV)</w:t>
       </w:r>
     </w:p>
     <w:p>
@@ -4750,8 +5233,8 @@
         <w:t xml:space="preserve">책임자: 인프라 팀. 재검토 일자: Phase 1 완료 시.</w:t>
       </w:r>
     </w:p>
-    <w:bookmarkEnd w:id="29"/>
-    <w:bookmarkEnd w:id="30"/>
+    <w:bookmarkEnd w:id="32"/>
+    <w:bookmarkEnd w:id="33"/>
     <w:sectPr>
       <w:footnotePr>
         <w:numRestart w:val="eachSect"/>

</xml_diff>